<commit_message>
P9 — filter bekerja dengan satu pendengar
</commit_message>
<xml_diff>
--- a/ADNAN HANIF RIANDITO - - Worksheet_P09.docx
+++ b/ADNAN HANIF RIANDITO - - Worksheet_P09.docx
@@ -182,8 +182,13 @@
               <w:spacing w:after="0"/>
             </w:pPr>
             <w:r>
-              <w:t>Adnan Hanif Riandito</w:t>
-            </w:r>
+              <w:t xml:space="preserve">Adnan Hanif </w:t>
+            </w:r>
+            <w:proofErr w:type="spellStart"/>
+            <w:r>
+              <w:t>Riandito</w:t>
+            </w:r>
+            <w:proofErr w:type="spellEnd"/>
           </w:p>
         </w:tc>
         <w:tc>
@@ -3187,6 +3192,12 @@
             <w:pPr>
               <w:spacing w:before="20" w:after="20" w:line="252" w:lineRule="auto"/>
             </w:pPr>
+            <w:r>
+              <w:t>#</w:t>
+            </w:r>
+            <w:r>
+              <w:t>daftar</w:t>
+            </w:r>
           </w:p>
         </w:tc>
         <w:tc>
@@ -3203,6 +3214,14 @@
             <w:pPr>
               <w:spacing w:before="20" w:after="20" w:line="252" w:lineRule="auto"/>
             </w:pPr>
+            <w:r>
+              <w:t xml:space="preserve">Kartu </w:t>
+            </w:r>
+            <w:proofErr w:type="spellStart"/>
+            <w:r>
+              <w:t>projek</w:t>
+            </w:r>
+            <w:proofErr w:type="spellEnd"/>
           </w:p>
         </w:tc>
         <w:tc>
@@ -3219,6 +3238,14 @@
             <w:pPr>
               <w:spacing w:before="20" w:after="20" w:line="252" w:lineRule="auto"/>
             </w:pPr>
+            <w:proofErr w:type="spellStart"/>
+            <w:r>
+              <w:t>daftar</w:t>
+            </w:r>
+            <w:r>
+              <w:t>Projek</w:t>
+            </w:r>
+            <w:proofErr w:type="spellEnd"/>
           </w:p>
         </w:tc>
       </w:tr>
@@ -3265,6 +3292,9 @@
             <w:pPr>
               <w:spacing w:before="20" w:after="20" w:line="252" w:lineRule="auto"/>
             </w:pPr>
+            <w:r>
+              <w:t>#filter</w:t>
+            </w:r>
           </w:p>
         </w:tc>
         <w:tc>
@@ -3281,6 +3311,27 @@
             <w:pPr>
               <w:spacing w:before="20" w:after="20" w:line="252" w:lineRule="auto"/>
             </w:pPr>
+            <w:proofErr w:type="spellStart"/>
+            <w:r>
+              <w:t>Tombol</w:t>
+            </w:r>
+            <w:proofErr w:type="spellEnd"/>
+            <w:r>
+              <w:t xml:space="preserve"> </w:t>
+            </w:r>
+            <w:proofErr w:type="spellStart"/>
+            <w:r>
+              <w:t>tombol</w:t>
+            </w:r>
+            <w:proofErr w:type="spellEnd"/>
+            <w:r>
+              <w:t xml:space="preserve"> filter </w:t>
+            </w:r>
+            <w:proofErr w:type="spellStart"/>
+            <w:r>
+              <w:t>kategori</w:t>
+            </w:r>
+            <w:proofErr w:type="spellEnd"/>
           </w:p>
         </w:tc>
         <w:tc>
@@ -3297,6 +3348,11 @@
             <w:pPr>
               <w:spacing w:before="20" w:after="20" w:line="252" w:lineRule="auto"/>
             </w:pPr>
+            <w:proofErr w:type="spellStart"/>
+            <w:r>
+              <w:t>tombolFilter</w:t>
+            </w:r>
+            <w:proofErr w:type="spellEnd"/>
           </w:p>
         </w:tc>
       </w:tr>
@@ -3343,6 +3399,9 @@
             <w:pPr>
               <w:spacing w:before="20" w:after="20" w:line="252" w:lineRule="auto"/>
             </w:pPr>
+            <w:r>
+              <w:t>#pesan-kosong</w:t>
+            </w:r>
           </w:p>
         </w:tc>
         <w:tc>
@@ -3359,6 +3418,54 @@
             <w:pPr>
               <w:spacing w:before="20" w:after="20" w:line="252" w:lineRule="auto"/>
             </w:pPr>
+            <w:r>
+              <w:t xml:space="preserve">Teks yang </w:t>
+            </w:r>
+            <w:proofErr w:type="spellStart"/>
+            <w:r>
+              <w:t>memberi</w:t>
+            </w:r>
+            <w:proofErr w:type="spellEnd"/>
+            <w:r>
+              <w:t xml:space="preserve"> </w:t>
+            </w:r>
+            <w:proofErr w:type="spellStart"/>
+            <w:r>
+              <w:t>tahu</w:t>
+            </w:r>
+            <w:proofErr w:type="spellEnd"/>
+            <w:r>
+              <w:t xml:space="preserve"> </w:t>
+            </w:r>
+            <w:proofErr w:type="spellStart"/>
+            <w:r>
+              <w:t>jika</w:t>
+            </w:r>
+            <w:proofErr w:type="spellEnd"/>
+            <w:r>
+              <w:t xml:space="preserve"> yang </w:t>
+            </w:r>
+            <w:proofErr w:type="spellStart"/>
+            <w:r>
+              <w:t>dicari</w:t>
+            </w:r>
+            <w:proofErr w:type="spellEnd"/>
+            <w:r>
+              <w:t xml:space="preserve"> </w:t>
+            </w:r>
+            <w:proofErr w:type="spellStart"/>
+            <w:r>
+              <w:t>tidak</w:t>
+            </w:r>
+            <w:proofErr w:type="spellEnd"/>
+            <w:r>
+              <w:t xml:space="preserve"> </w:t>
+            </w:r>
+            <w:proofErr w:type="spellStart"/>
+            <w:r>
+              <w:t>ada</w:t>
+            </w:r>
+            <w:proofErr w:type="spellEnd"/>
           </w:p>
         </w:tc>
         <w:tc>
@@ -3375,6 +3482,11 @@
             <w:pPr>
               <w:spacing w:before="20" w:after="20" w:line="252" w:lineRule="auto"/>
             </w:pPr>
+            <w:proofErr w:type="spellStart"/>
+            <w:r>
+              <w:t>pesanKosong</w:t>
+            </w:r>
+            <w:proofErr w:type="spellEnd"/>
           </w:p>
         </w:tc>
       </w:tr>
@@ -3421,6 +3533,9 @@
             <w:pPr>
               <w:spacing w:before="20" w:after="20" w:line="252" w:lineRule="auto"/>
             </w:pPr>
+            <w:r>
+              <w:t>#filter button</w:t>
+            </w:r>
           </w:p>
         </w:tc>
         <w:tc>
@@ -3437,6 +3552,33 @@
             <w:pPr>
               <w:spacing w:before="20" w:after="20" w:line="252" w:lineRule="auto"/>
             </w:pPr>
+            <w:r>
+              <w:t xml:space="preserve">Nama </w:t>
+            </w:r>
+            <w:proofErr w:type="spellStart"/>
+            <w:r>
+              <w:t>semua</w:t>
+            </w:r>
+            <w:proofErr w:type="spellEnd"/>
+            <w:r>
+              <w:t xml:space="preserve"> </w:t>
+            </w:r>
+            <w:proofErr w:type="spellStart"/>
+            <w:r>
+              <w:t>tombol</w:t>
+            </w:r>
+            <w:proofErr w:type="spellEnd"/>
+            <w:r>
+              <w:t xml:space="preserve"> </w:t>
+            </w:r>
+            <w:proofErr w:type="spellStart"/>
+            <w:r>
+              <w:t>didalam</w:t>
+            </w:r>
+            <w:proofErr w:type="spellEnd"/>
+            <w:r>
+              <w:t xml:space="preserve"> filter</w:t>
+            </w:r>
           </w:p>
         </w:tc>
         <w:tc>
@@ -3453,6 +3595,11 @@
             <w:pPr>
               <w:spacing w:before="20" w:after="20" w:line="252" w:lineRule="auto"/>
             </w:pPr>
+            <w:proofErr w:type="spellStart"/>
+            <w:r>
+              <w:t>namaFilter</w:t>
+            </w:r>
+            <w:proofErr w:type="spellEnd"/>
           </w:p>
         </w:tc>
       </w:tr>
@@ -4072,6 +4219,9 @@
             <w:pPr>
               <w:spacing w:before="20" w:after="20" w:line="252" w:lineRule="auto"/>
             </w:pPr>
+            <w:r>
+              <w:sym w:font="Wingdings" w:char="F0FC"/>
+            </w:r>
           </w:p>
         </w:tc>
       </w:tr>
@@ -4100,6 +4250,7 @@
                 <w:rFonts w:cs="Carlito"/>
                 <w:sz w:val="19"/>
               </w:rPr>
+              <w:lastRenderedPageBreak/>
               <w:t>profil.html sudah punya ul id="daftar", div id="filter" bertombol data-kategori, dan p id="pesan-kosong" dengan atribut hidden</w:t>
             </w:r>
           </w:p>
@@ -4118,6 +4269,9 @@
             <w:pPr>
               <w:spacing w:before="20" w:after="20" w:line="252" w:lineRule="auto"/>
             </w:pPr>
+            <w:r>
+              <w:sym w:font="Wingdings" w:char="F0FC"/>
+            </w:r>
           </w:p>
         </w:tc>
       </w:tr>
@@ -4164,6 +4318,9 @@
             <w:pPr>
               <w:spacing w:before="20" w:after="20" w:line="252" w:lineRule="auto"/>
             </w:pPr>
+            <w:r>
+              <w:sym w:font="Wingdings" w:char="F0FC"/>
+            </w:r>
           </w:p>
         </w:tc>
       </w:tr>
@@ -4210,6 +4367,9 @@
             <w:pPr>
               <w:spacing w:before="20" w:after="20" w:line="252" w:lineRule="auto"/>
             </w:pPr>
+            <w:r>
+              <w:sym w:font="Wingdings" w:char="F0FC"/>
+            </w:r>
           </w:p>
         </w:tc>
       </w:tr>
@@ -4238,7 +4398,6 @@
                 <w:rFonts w:cs="Carlito"/>
                 <w:sz w:val="19"/>
               </w:rPr>
-              <w:lastRenderedPageBreak/>
               <w:t>Halaman dibuka lewat server lokal; Console tidak menampilkan pesan 404</w:t>
             </w:r>
           </w:p>
@@ -4257,6 +4416,9 @@
             <w:pPr>
               <w:spacing w:before="20" w:after="20" w:line="252" w:lineRule="auto"/>
             </w:pPr>
+            <w:r>
+              <w:sym w:font="Wingdings" w:char="F0FC"/>
+            </w:r>
           </w:p>
         </w:tc>
       </w:tr>
@@ -4303,6 +4465,9 @@
             <w:pPr>
               <w:spacing w:before="20" w:after="20" w:line="252" w:lineRule="auto"/>
             </w:pPr>
+            <w:r>
+              <w:sym w:font="Wingdings" w:char="F0FC"/>
+            </w:r>
           </w:p>
         </w:tc>
       </w:tr>
@@ -5937,6 +6102,35 @@
             <w:pPr>
               <w:spacing w:before="20" w:after="20" w:line="252" w:lineRule="auto"/>
             </w:pPr>
+            <w:proofErr w:type="spellStart"/>
+            <w:r>
+              <w:t>Jumlah</w:t>
+            </w:r>
+            <w:proofErr w:type="spellEnd"/>
+            <w:r>
+              <w:t xml:space="preserve"> </w:t>
+            </w:r>
+            <w:proofErr w:type="spellStart"/>
+            <w:r>
+              <w:t>sama</w:t>
+            </w:r>
+            <w:proofErr w:type="spellEnd"/>
+            <w:r>
+              <w:t xml:space="preserve"> </w:t>
+            </w:r>
+            <w:proofErr w:type="spellStart"/>
+            <w:r>
+              <w:t>dengan</w:t>
+            </w:r>
+            <w:proofErr w:type="spellEnd"/>
+            <w:r>
+              <w:t xml:space="preserve"> </w:t>
+            </w:r>
+            <w:proofErr w:type="spellStart"/>
+            <w:r>
+              <w:t>daftarProyek</w:t>
+            </w:r>
+            <w:proofErr w:type="spellEnd"/>
           </w:p>
         </w:tc>
       </w:tr>
@@ -6006,6 +6200,17 @@
             <w:pPr>
               <w:spacing w:before="20" w:after="20" w:line="252" w:lineRule="auto"/>
             </w:pPr>
+            <w:r>
+              <w:t xml:space="preserve">Stress shield, </w:t>
+            </w:r>
+            <w:proofErr w:type="spellStart"/>
+            <w:r>
+              <w:t>sama</w:t>
+            </w:r>
+            <w:proofErr w:type="spellEnd"/>
+            <w:r>
+              <w:t xml:space="preserve"> </w:t>
+            </w:r>
           </w:p>
         </w:tc>
       </w:tr>
@@ -6071,6 +6276,32 @@
               <w:right w:val="single" w:sz="6" w:space="0" w:color="D8DEE9"/>
             </w:tcBorders>
           </w:tcPr>
+          <w:p>
+            <w:pPr>
+              <w:spacing w:before="20" w:after="20" w:line="252" w:lineRule="auto"/>
+            </w:pPr>
+            <w:proofErr w:type="spellStart"/>
+            <w:r>
+              <w:t>Tampil</w:t>
+            </w:r>
+            <w:proofErr w:type="spellEnd"/>
+            <w:r>
+              <w:t xml:space="preserve"> </w:t>
+            </w:r>
+            <w:proofErr w:type="spellStart"/>
+            <w:r>
+              <w:t>sebagai</w:t>
+            </w:r>
+            <w:proofErr w:type="spellEnd"/>
+            <w:r>
+              <w:t xml:space="preserve"> </w:t>
+            </w:r>
+            <w:proofErr w:type="spellStart"/>
+            <w:r>
+              <w:t>teks</w:t>
+            </w:r>
+            <w:proofErr w:type="spellEnd"/>
+          </w:p>
           <w:p>
             <w:pPr>
               <w:spacing w:before="20" w:after="20" w:line="252" w:lineRule="auto"/>
@@ -7401,6 +7632,88 @@
             <w:pPr>
               <w:spacing w:before="20" w:after="20" w:line="252" w:lineRule="auto"/>
             </w:pPr>
+            <w:proofErr w:type="spellStart"/>
+            <w:r>
+              <w:t>Tombol</w:t>
+            </w:r>
+            <w:proofErr w:type="spellEnd"/>
+            <w:r>
+              <w:t xml:space="preserve"> “</w:t>
+            </w:r>
+            <w:proofErr w:type="spellStart"/>
+            <w:r>
+              <w:t>semua</w:t>
+            </w:r>
+            <w:proofErr w:type="spellEnd"/>
+            <w:r>
+              <w:t xml:space="preserve">” </w:t>
+            </w:r>
+            <w:proofErr w:type="spellStart"/>
+            <w:r>
+              <w:t>memiliki</w:t>
+            </w:r>
+            <w:proofErr w:type="spellEnd"/>
+            <w:r>
+              <w:t xml:space="preserve"> outline</w:t>
+            </w:r>
+          </w:p>
+          <w:p>
+            <w:pPr>
+              <w:spacing w:before="20" w:after="20" w:line="252" w:lineRule="auto"/>
+            </w:pPr>
+            <w:r>
+              <w:rPr>
+                <w:noProof/>
+              </w:rPr>
+              <w:drawing>
+                <wp:inline distT="0" distB="0" distL="0" distR="0" wp14:anchorId="359CAE6C" wp14:editId="5FFDE499">
+                  <wp:extent cx="2366010" cy="783590"/>
+                  <wp:effectExtent l="0" t="0" r="0" b="0"/>
+                  <wp:docPr id="1703743330" name="Picture 1"/>
+                  <wp:cNvGraphicFramePr>
+                    <a:graphicFrameLocks xmlns:a="http://schemas.openxmlformats.org/drawingml/2006/main" noChangeAspect="1"/>
+                  </wp:cNvGraphicFramePr>
+                  <a:graphic xmlns:a="http://schemas.openxmlformats.org/drawingml/2006/main">
+                    <a:graphicData uri="http://schemas.openxmlformats.org/drawingml/2006/picture">
+                      <pic:pic xmlns:pic="http://schemas.openxmlformats.org/drawingml/2006/picture">
+                        <pic:nvPicPr>
+                          <pic:cNvPr id="0" name="Picture 1"/>
+                          <pic:cNvPicPr>
+                            <a:picLocks noChangeAspect="1" noChangeArrowheads="1"/>
+                          </pic:cNvPicPr>
+                        </pic:nvPicPr>
+                        <pic:blipFill>
+                          <a:blip r:embed="rId8">
+                            <a:extLst>
+                              <a:ext uri="{28A0092B-C50C-407E-A947-70E740481C1C}">
+                                <a14:useLocalDpi xmlns:a14="http://schemas.microsoft.com/office/drawing/2010/main" val="0"/>
+                              </a:ext>
+                            </a:extLst>
+                          </a:blip>
+                          <a:srcRect/>
+                          <a:stretch>
+                            <a:fillRect/>
+                          </a:stretch>
+                        </pic:blipFill>
+                        <pic:spPr bwMode="auto">
+                          <a:xfrm>
+                            <a:off x="0" y="0"/>
+                            <a:ext cx="2366010" cy="783590"/>
+                          </a:xfrm>
+                          <a:prstGeom prst="rect">
+                            <a:avLst/>
+                          </a:prstGeom>
+                          <a:noFill/>
+                          <a:ln>
+                            <a:noFill/>
+                          </a:ln>
+                        </pic:spPr>
+                      </pic:pic>
+                    </a:graphicData>
+                  </a:graphic>
+                </wp:inline>
+              </w:drawing>
+            </w:r>
           </w:p>
         </w:tc>
       </w:tr>
@@ -17162,7 +17475,7 @@
       </w:pPr>
     </w:p>
     <w:sectPr>
-      <w:footerReference w:type="default" r:id="rId8"/>
+      <w:footerReference w:type="default" r:id="rId9"/>
       <w:pgSz w:w="11906" w:h="16838"/>
       <w:pgMar w:top="964" w:right="1077" w:bottom="907" w:left="1077" w:header="720" w:footer="720" w:gutter="0"/>
       <w:cols w:space="720"/>
@@ -17210,7 +17523,97 @@
         <w:color w:val="5A6080"/>
         <w:sz w:val="15"/>
       </w:rPr>
-      <w:t>PABW 2026/2027  ·  Pertemuan 9  ·  DOM dan Event  ·  Universitas Islam Indonesia  ·  halaman</w:t>
+      <w:t>PABW 2026/</w:t>
+    </w:r>
+    <w:proofErr w:type="gramStart"/>
+    <w:r>
+      <w:rPr>
+        <w:rFonts w:cs="Carlito"/>
+        <w:color w:val="5A6080"/>
+        <w:sz w:val="15"/>
+      </w:rPr>
+      <w:t>2027  ·</w:t>
+    </w:r>
+    <w:proofErr w:type="gramEnd"/>
+    <w:r>
+      <w:rPr>
+        <w:rFonts w:cs="Carlito"/>
+        <w:color w:val="5A6080"/>
+        <w:sz w:val="15"/>
+      </w:rPr>
+      <w:t xml:space="preserve">  </w:t>
+    </w:r>
+    <w:proofErr w:type="spellStart"/>
+    <w:r>
+      <w:rPr>
+        <w:rFonts w:cs="Carlito"/>
+        <w:color w:val="5A6080"/>
+        <w:sz w:val="15"/>
+      </w:rPr>
+      <w:t>Pertemuan</w:t>
+    </w:r>
+    <w:proofErr w:type="spellEnd"/>
+    <w:r>
+      <w:rPr>
+        <w:rFonts w:cs="Carlito"/>
+        <w:color w:val="5A6080"/>
+        <w:sz w:val="15"/>
+      </w:rPr>
+      <w:t xml:space="preserve"> </w:t>
+    </w:r>
+    <w:proofErr w:type="gramStart"/>
+    <w:r>
+      <w:rPr>
+        <w:rFonts w:cs="Carlito"/>
+        <w:color w:val="5A6080"/>
+        <w:sz w:val="15"/>
+      </w:rPr>
+      <w:t>9  ·</w:t>
+    </w:r>
+    <w:proofErr w:type="gramEnd"/>
+    <w:r>
+      <w:rPr>
+        <w:rFonts w:cs="Carlito"/>
+        <w:color w:val="5A6080"/>
+        <w:sz w:val="15"/>
+      </w:rPr>
+      <w:t xml:space="preserve">  DOM dan </w:t>
+    </w:r>
+    <w:proofErr w:type="gramStart"/>
+    <w:r>
+      <w:rPr>
+        <w:rFonts w:cs="Carlito"/>
+        <w:color w:val="5A6080"/>
+        <w:sz w:val="15"/>
+      </w:rPr>
+      <w:t>Event  ·</w:t>
+    </w:r>
+    <w:proofErr w:type="gramEnd"/>
+    <w:r>
+      <w:rPr>
+        <w:rFonts w:cs="Carlito"/>
+        <w:color w:val="5A6080"/>
+        <w:sz w:val="15"/>
+      </w:rPr>
+      <w:t xml:space="preserve">  Universitas Islam </w:t>
+    </w:r>
+    <w:proofErr w:type="gramStart"/>
+    <w:r>
+      <w:rPr>
+        <w:rFonts w:cs="Carlito"/>
+        <w:color w:val="5A6080"/>
+        <w:sz w:val="15"/>
+      </w:rPr>
+      <w:t>Indonesia  ·</w:t>
+    </w:r>
+    <w:proofErr w:type="gramEnd"/>
+    <w:r>
+      <w:rPr>
+        <w:rFonts w:cs="Carlito"/>
+        <w:color w:val="5A6080"/>
+        <w:sz w:val="15"/>
+      </w:rPr>
+      <w:t xml:space="preserve">  halaman</w:t>
     </w:r>
     <w:r>
       <w:fldChar w:fldCharType="begin"/>

</xml_diff>

<commit_message>
p9 lewat deadline lupa kirim
</commit_message>
<xml_diff>
--- a/ADNAN HANIF RIANDITO - - Worksheet_P09.docx
+++ b/ADNAN HANIF RIANDITO - - Worksheet_P09.docx
@@ -7783,6 +7783,46 @@
             <w:pPr>
               <w:spacing w:before="20" w:after="20" w:line="252" w:lineRule="auto"/>
             </w:pPr>
+            <w:r>
+              <w:rPr>
+                <w:noProof/>
+              </w:rPr>
+              <w:drawing>
+                <wp:inline distT="0" distB="0" distL="0" distR="0" wp14:anchorId="2D360E13" wp14:editId="0DC6C85F">
+                  <wp:extent cx="2366010" cy="744855"/>
+                  <wp:effectExtent l="0" t="0" r="0" b="0"/>
+                  <wp:docPr id="31913446" name="Picture 1"/>
+                  <wp:cNvGraphicFramePr>
+                    <a:graphicFrameLocks xmlns:a="http://schemas.openxmlformats.org/drawingml/2006/main" noChangeAspect="1"/>
+                  </wp:cNvGraphicFramePr>
+                  <a:graphic xmlns:a="http://schemas.openxmlformats.org/drawingml/2006/main">
+                    <a:graphicData uri="http://schemas.openxmlformats.org/drawingml/2006/picture">
+                      <pic:pic xmlns:pic="http://schemas.openxmlformats.org/drawingml/2006/picture">
+                        <pic:nvPicPr>
+                          <pic:cNvPr id="31913446" name=""/>
+                          <pic:cNvPicPr/>
+                        </pic:nvPicPr>
+                        <pic:blipFill>
+                          <a:blip r:embed="rId9"/>
+                          <a:stretch>
+                            <a:fillRect/>
+                          </a:stretch>
+                        </pic:blipFill>
+                        <pic:spPr>
+                          <a:xfrm>
+                            <a:off x="0" y="0"/>
+                            <a:ext cx="2366010" cy="744855"/>
+                          </a:xfrm>
+                          <a:prstGeom prst="rect">
+                            <a:avLst/>
+                          </a:prstGeom>
+                        </pic:spPr>
+                      </pic:pic>
+                    </a:graphicData>
+                  </a:graphic>
+                </wp:inline>
+              </w:drawing>
+            </w:r>
           </w:p>
         </w:tc>
       </w:tr>
@@ -7921,6 +7961,14 @@
             <w:pPr>
               <w:spacing w:before="20" w:after="20" w:line="252" w:lineRule="auto"/>
             </w:pPr>
+            <w:r>
+              <w:t xml:space="preserve">Tidak </w:t>
+            </w:r>
+            <w:proofErr w:type="spellStart"/>
+            <w:r>
+              <w:t>berlipat</w:t>
+            </w:r>
+            <w:proofErr w:type="spellEnd"/>
           </w:p>
         </w:tc>
       </w:tr>
@@ -9568,6 +9616,14 @@
             <w:pPr>
               <w:spacing w:before="20" w:after="20" w:line="252" w:lineRule="auto"/>
             </w:pPr>
+            <w:proofErr w:type="spellStart"/>
+            <w:r>
+              <w:t>Sesuai</w:t>
+            </w:r>
+            <w:proofErr w:type="spellEnd"/>
+            <w:r>
+              <w:t xml:space="preserve"> </w:t>
+            </w:r>
           </w:p>
         </w:tc>
       </w:tr>
@@ -9637,6 +9693,11 @@
             <w:pPr>
               <w:spacing w:before="20" w:after="20" w:line="252" w:lineRule="auto"/>
             </w:pPr>
+            <w:proofErr w:type="spellStart"/>
+            <w:r>
+              <w:t>sesuai</w:t>
+            </w:r>
+            <w:proofErr w:type="spellEnd"/>
           </w:p>
         </w:tc>
       </w:tr>
@@ -9706,6 +9767,11 @@
             <w:pPr>
               <w:spacing w:before="20" w:after="20" w:line="252" w:lineRule="auto"/>
             </w:pPr>
+            <w:proofErr w:type="spellStart"/>
+            <w:r>
+              <w:t>sesuai</w:t>
+            </w:r>
+            <w:proofErr w:type="spellEnd"/>
           </w:p>
         </w:tc>
       </w:tr>
@@ -9775,6 +9841,11 @@
             <w:pPr>
               <w:spacing w:before="20" w:after="20" w:line="252" w:lineRule="auto"/>
             </w:pPr>
+            <w:proofErr w:type="spellStart"/>
+            <w:r>
+              <w:t>sesuai</w:t>
+            </w:r>
+            <w:proofErr w:type="spellEnd"/>
           </w:p>
         </w:tc>
       </w:tr>
@@ -11582,6 +11653,9 @@
             <w:pPr>
               <w:spacing w:before="20" w:after="20" w:line="252" w:lineRule="auto"/>
             </w:pPr>
+            <w:r>
+              <w:t>-</w:t>
+            </w:r>
           </w:p>
         </w:tc>
         <w:tc>
@@ -11598,6 +11672,9 @@
             <w:pPr>
               <w:spacing w:before="20" w:after="20" w:line="252" w:lineRule="auto"/>
             </w:pPr>
+            <w:r>
+              <w:t>-</w:t>
+            </w:r>
           </w:p>
         </w:tc>
         <w:tc>
@@ -11614,6 +11691,9 @@
             <w:pPr>
               <w:spacing w:before="20" w:after="20" w:line="252" w:lineRule="auto"/>
             </w:pPr>
+            <w:r>
+              <w:t>-</w:t>
+            </w:r>
           </w:p>
         </w:tc>
       </w:tr>
@@ -12179,7 +12259,129 @@
               <w:right w:val="single" w:sz="4" w:space="0" w:color="B9C6E2"/>
             </w:tcBorders>
           </w:tcPr>
-          <w:p/>
+          <w:p>
+            <w:proofErr w:type="spellStart"/>
+            <w:r>
+              <w:t>Elemen</w:t>
+            </w:r>
+            <w:proofErr w:type="spellEnd"/>
+            <w:r>
+              <w:t xml:space="preserve"> yang </w:t>
+            </w:r>
+            <w:proofErr w:type="spellStart"/>
+            <w:r>
+              <w:t>saya</w:t>
+            </w:r>
+            <w:proofErr w:type="spellEnd"/>
+            <w:r>
+              <w:t xml:space="preserve"> </w:t>
+            </w:r>
+            <w:proofErr w:type="spellStart"/>
+            <w:r>
+              <w:t>ambil</w:t>
+            </w:r>
+            <w:proofErr w:type="spellEnd"/>
+            <w:r>
+              <w:t xml:space="preserve"> </w:t>
+            </w:r>
+            <w:proofErr w:type="spellStart"/>
+            <w:r>
+              <w:t>adalah</w:t>
+            </w:r>
+            <w:proofErr w:type="spellEnd"/>
+            <w:r>
+              <w:t xml:space="preserve"> </w:t>
+            </w:r>
+            <w:proofErr w:type="spellStart"/>
+            <w:r>
+              <w:t>wadah</w:t>
+            </w:r>
+            <w:proofErr w:type="spellEnd"/>
+            <w:r>
+              <w:t xml:space="preserve"> daftar </w:t>
+            </w:r>
+            <w:proofErr w:type="spellStart"/>
+            <w:r>
+              <w:t>proyek</w:t>
+            </w:r>
+            <w:proofErr w:type="spellEnd"/>
+            <w:r>
+              <w:t xml:space="preserve"> </w:t>
+            </w:r>
+            <w:proofErr w:type="spellStart"/>
+            <w:r>
+              <w:t>menggunakan</w:t>
+            </w:r>
+            <w:proofErr w:type="spellEnd"/>
+            <w:r>
+              <w:t xml:space="preserve"> selector #daftar</w:t>
+            </w:r>
+            <w:r>
+              <w:t xml:space="preserve">, </w:t>
+            </w:r>
+            <w:proofErr w:type="spellStart"/>
+            <w:r>
+              <w:t>disimpan</w:t>
+            </w:r>
+            <w:proofErr w:type="spellEnd"/>
+            <w:r>
+              <w:t xml:space="preserve"> </w:t>
+            </w:r>
+            <w:proofErr w:type="spellStart"/>
+            <w:r>
+              <w:t>dalam</w:t>
+            </w:r>
+            <w:proofErr w:type="spellEnd"/>
+            <w:r>
+              <w:t xml:space="preserve"> </w:t>
+            </w:r>
+            <w:proofErr w:type="spellStart"/>
+            <w:r>
+              <w:t>variabel</w:t>
+            </w:r>
+            <w:proofErr w:type="spellEnd"/>
+            <w:r>
+              <w:t xml:space="preserve"> </w:t>
+            </w:r>
+            <w:r>
+              <w:t>“</w:t>
+            </w:r>
+            <w:proofErr w:type="spellStart"/>
+            <w:r>
+              <w:t>wadah</w:t>
+            </w:r>
+            <w:proofErr w:type="spellEnd"/>
+            <w:r>
+              <w:t>”</w:t>
+            </w:r>
+            <w:r>
+              <w:t xml:space="preserve"> </w:t>
+            </w:r>
+            <w:proofErr w:type="spellStart"/>
+            <w:r>
+              <w:t>dengan</w:t>
+            </w:r>
+            <w:proofErr w:type="spellEnd"/>
+            <w:r>
+              <w:t xml:space="preserve"> const </w:t>
+            </w:r>
+            <w:proofErr w:type="spellStart"/>
+            <w:r>
+              <w:t>wadah</w:t>
+            </w:r>
+            <w:proofErr w:type="spellEnd"/>
+            <w:r>
+              <w:t xml:space="preserve"> = </w:t>
+            </w:r>
+            <w:proofErr w:type="spellStart"/>
+            <w:r>
+              <w:t>document.querySelector</w:t>
+            </w:r>
+            <w:proofErr w:type="spellEnd"/>
+            <w:r>
+              <w:t>("#daftar");</w:t>
+            </w:r>
+          </w:p>
         </w:tc>
       </w:tr>
       <w:tr>
@@ -12241,7 +12443,128 @@
               <w:right w:val="single" w:sz="4" w:space="0" w:color="B9C6E2"/>
             </w:tcBorders>
           </w:tcPr>
-          <w:p/>
+          <w:p>
+            <w:proofErr w:type="spellStart"/>
+            <w:r>
+              <w:t>querySelector</w:t>
+            </w:r>
+            <w:proofErr w:type="spellEnd"/>
+            <w:r>
+              <w:t xml:space="preserve"> </w:t>
+            </w:r>
+            <w:proofErr w:type="spellStart"/>
+            <w:r>
+              <w:t>mengambil</w:t>
+            </w:r>
+            <w:proofErr w:type="spellEnd"/>
+            <w:r>
+              <w:t xml:space="preserve"> </w:t>
+            </w:r>
+            <w:proofErr w:type="spellStart"/>
+            <w:r>
+              <w:t>elemen</w:t>
+            </w:r>
+            <w:proofErr w:type="spellEnd"/>
+            <w:r>
+              <w:t xml:space="preserve"> </w:t>
+            </w:r>
+            <w:proofErr w:type="spellStart"/>
+            <w:r>
+              <w:t>pertama</w:t>
+            </w:r>
+            <w:proofErr w:type="spellEnd"/>
+            <w:r>
+              <w:t xml:space="preserve"> yang </w:t>
+            </w:r>
+            <w:proofErr w:type="spellStart"/>
+            <w:r>
+              <w:t>cocok</w:t>
+            </w:r>
+            <w:proofErr w:type="spellEnd"/>
+            <w:r>
+              <w:t xml:space="preserve"> </w:t>
+            </w:r>
+            <w:proofErr w:type="spellStart"/>
+            <w:r>
+              <w:t>dengan</w:t>
+            </w:r>
+            <w:proofErr w:type="spellEnd"/>
+            <w:r>
+              <w:t xml:space="preserve"> selector, </w:t>
+            </w:r>
+            <w:proofErr w:type="spellStart"/>
+            <w:r>
+              <w:t>sedangkan</w:t>
+            </w:r>
+            <w:proofErr w:type="spellEnd"/>
+            <w:r>
+              <w:t xml:space="preserve"> </w:t>
+            </w:r>
+            <w:proofErr w:type="spellStart"/>
+            <w:r>
+              <w:t>querySelectorAll</w:t>
+            </w:r>
+            <w:proofErr w:type="spellEnd"/>
+            <w:r>
+              <w:t xml:space="preserve"> </w:t>
+            </w:r>
+            <w:proofErr w:type="spellStart"/>
+            <w:r>
+              <w:t>mengambil</w:t>
+            </w:r>
+            <w:proofErr w:type="spellEnd"/>
+            <w:r>
+              <w:t xml:space="preserve"> </w:t>
+            </w:r>
+            <w:proofErr w:type="spellStart"/>
+            <w:r>
+              <w:t>semua</w:t>
+            </w:r>
+            <w:proofErr w:type="spellEnd"/>
+            <w:r>
+              <w:t xml:space="preserve"> </w:t>
+            </w:r>
+            <w:proofErr w:type="spellStart"/>
+            <w:r>
+              <w:t>elemen</w:t>
+            </w:r>
+            <w:proofErr w:type="spellEnd"/>
+            <w:r>
+              <w:t xml:space="preserve"> yang </w:t>
+            </w:r>
+            <w:proofErr w:type="spellStart"/>
+            <w:r>
+              <w:t>cocok</w:t>
+            </w:r>
+            <w:proofErr w:type="spellEnd"/>
+            <w:r>
+              <w:t xml:space="preserve"> </w:t>
+            </w:r>
+            <w:proofErr w:type="spellStart"/>
+            <w:r>
+              <w:t>dalam</w:t>
+            </w:r>
+            <w:proofErr w:type="spellEnd"/>
+            <w:r>
+              <w:t xml:space="preserve"> </w:t>
+            </w:r>
+            <w:proofErr w:type="spellStart"/>
+            <w:r>
+              <w:t>bentuk</w:t>
+            </w:r>
+            <w:proofErr w:type="spellEnd"/>
+            <w:r>
+              <w:t xml:space="preserve"> </w:t>
+            </w:r>
+            <w:proofErr w:type="spellStart"/>
+            <w:r>
+              <w:t>NodeList</w:t>
+            </w:r>
+            <w:proofErr w:type="spellEnd"/>
+            <w:r>
+              <w:t xml:space="preserve">. </w:t>
+            </w:r>
+          </w:p>
         </w:tc>
       </w:tr>
       <w:tr>
@@ -12258,7 +12581,118 @@
               <w:right w:val="single" w:sz="4" w:space="0" w:color="B9C6E2"/>
             </w:tcBorders>
           </w:tcPr>
-          <w:p/>
+          <w:p>
+            <w:r>
+              <w:t xml:space="preserve">Metode map </w:t>
+            </w:r>
+            <w:proofErr w:type="spellStart"/>
+            <w:r>
+              <w:t>tidak</w:t>
+            </w:r>
+            <w:proofErr w:type="spellEnd"/>
+            <w:r>
+              <w:t xml:space="preserve"> </w:t>
+            </w:r>
+            <w:proofErr w:type="spellStart"/>
+            <w:r>
+              <w:t>bisa</w:t>
+            </w:r>
+            <w:proofErr w:type="spellEnd"/>
+            <w:r>
+              <w:t xml:space="preserve"> </w:t>
+            </w:r>
+            <w:proofErr w:type="spellStart"/>
+            <w:r>
+              <w:t>langsung</w:t>
+            </w:r>
+            <w:proofErr w:type="spellEnd"/>
+            <w:r>
+              <w:t xml:space="preserve"> </w:t>
+            </w:r>
+            <w:proofErr w:type="spellStart"/>
+            <w:r>
+              <w:t>digunakan</w:t>
+            </w:r>
+            <w:proofErr w:type="spellEnd"/>
+            <w:r>
+              <w:t xml:space="preserve"> </w:t>
+            </w:r>
+            <w:proofErr w:type="spellStart"/>
+            <w:r>
+              <w:t>karena</w:t>
+            </w:r>
+            <w:proofErr w:type="spellEnd"/>
+            <w:r>
+              <w:t xml:space="preserve"> </w:t>
+            </w:r>
+            <w:proofErr w:type="spellStart"/>
+            <w:r>
+              <w:t>NodeList</w:t>
+            </w:r>
+            <w:proofErr w:type="spellEnd"/>
+            <w:r>
+              <w:t xml:space="preserve"> </w:t>
+            </w:r>
+            <w:proofErr w:type="spellStart"/>
+            <w:r>
+              <w:t>bukan</w:t>
+            </w:r>
+            <w:proofErr w:type="spellEnd"/>
+            <w:r>
+              <w:t xml:space="preserve"> Array. Agar </w:t>
+            </w:r>
+            <w:proofErr w:type="spellStart"/>
+            <w:r>
+              <w:t>bisa</w:t>
+            </w:r>
+            <w:proofErr w:type="spellEnd"/>
+            <w:r>
+              <w:t xml:space="preserve"> </w:t>
+            </w:r>
+            <w:proofErr w:type="spellStart"/>
+            <w:r>
+              <w:t>menggunakan</w:t>
+            </w:r>
+            <w:proofErr w:type="spellEnd"/>
+            <w:r>
+              <w:t xml:space="preserve"> map, h</w:t>
+            </w:r>
+            <w:proofErr w:type="spellStart"/>
+            <w:r>
+              <w:t>asilnya</w:t>
+            </w:r>
+            <w:proofErr w:type="spellEnd"/>
+            <w:r>
+              <w:t xml:space="preserve"> </w:t>
+            </w:r>
+            <w:proofErr w:type="spellStart"/>
+            <w:r>
+              <w:t>harus</w:t>
+            </w:r>
+            <w:proofErr w:type="spellEnd"/>
+            <w:r>
+              <w:t xml:space="preserve"> </w:t>
+            </w:r>
+            <w:proofErr w:type="spellStart"/>
+            <w:r>
+              <w:t>diubah</w:t>
+            </w:r>
+            <w:proofErr w:type="spellEnd"/>
+            <w:r>
+              <w:t xml:space="preserve"> </w:t>
+            </w:r>
+            <w:proofErr w:type="spellStart"/>
+            <w:r>
+              <w:t>menjadi</w:t>
+            </w:r>
+            <w:proofErr w:type="spellEnd"/>
+            <w:r>
+              <w:t xml:space="preserve"> Array</w:t>
+            </w:r>
+            <w:r>
+              <w:t>.</w:t>
+            </w:r>
+          </w:p>
         </w:tc>
       </w:tr>
     </w:tbl>
@@ -12303,7 +12737,136 @@
               <w:right w:val="single" w:sz="4" w:space="0" w:color="B9C6E2"/>
             </w:tcBorders>
           </w:tcPr>
-          <w:p/>
+          <w:p>
+            <w:proofErr w:type="spellStart"/>
+            <w:r>
+              <w:t>Keuntungannya</w:t>
+            </w:r>
+            <w:proofErr w:type="spellEnd"/>
+            <w:r>
+              <w:t xml:space="preserve"> </w:t>
+            </w:r>
+            <w:proofErr w:type="spellStart"/>
+            <w:r>
+              <w:t>adalah</w:t>
+            </w:r>
+            <w:proofErr w:type="spellEnd"/>
+            <w:r>
+              <w:t xml:space="preserve"> </w:t>
+            </w:r>
+            <w:proofErr w:type="spellStart"/>
+            <w:r>
+              <w:t>kode</w:t>
+            </w:r>
+            <w:proofErr w:type="spellEnd"/>
+            <w:r>
+              <w:t xml:space="preserve"> </w:t>
+            </w:r>
+            <w:proofErr w:type="spellStart"/>
+            <w:r>
+              <w:t>menjadi</w:t>
+            </w:r>
+            <w:proofErr w:type="spellEnd"/>
+            <w:r>
+              <w:t xml:space="preserve"> </w:t>
+            </w:r>
+            <w:proofErr w:type="spellStart"/>
+            <w:r>
+              <w:t>lebih</w:t>
+            </w:r>
+            <w:proofErr w:type="spellEnd"/>
+            <w:r>
+              <w:t xml:space="preserve"> </w:t>
+            </w:r>
+            <w:proofErr w:type="spellStart"/>
+            <w:r>
+              <w:t>pendek</w:t>
+            </w:r>
+            <w:proofErr w:type="spellEnd"/>
+            <w:r>
+              <w:t xml:space="preserve"> </w:t>
+            </w:r>
+            <w:proofErr w:type="spellStart"/>
+            <w:r>
+              <w:t>karena</w:t>
+            </w:r>
+            <w:proofErr w:type="spellEnd"/>
+            <w:r>
+              <w:t xml:space="preserve"> </w:t>
+            </w:r>
+            <w:proofErr w:type="spellStart"/>
+            <w:r>
+              <w:t>cukup</w:t>
+            </w:r>
+            <w:proofErr w:type="spellEnd"/>
+            <w:r>
+              <w:t xml:space="preserve"> </w:t>
+            </w:r>
+            <w:proofErr w:type="spellStart"/>
+            <w:r>
+              <w:t>dipasang</w:t>
+            </w:r>
+            <w:proofErr w:type="spellEnd"/>
+            <w:r>
+              <w:t xml:space="preserve"> pada </w:t>
+            </w:r>
+            <w:proofErr w:type="spellStart"/>
+            <w:r>
+              <w:t>elemen</w:t>
+            </w:r>
+            <w:proofErr w:type="spellEnd"/>
+            <w:r>
+              <w:t xml:space="preserve"> </w:t>
+            </w:r>
+            <w:proofErr w:type="spellStart"/>
+            <w:r>
+              <w:t>induk</w:t>
+            </w:r>
+            <w:proofErr w:type="spellEnd"/>
+            <w:r>
+              <w:t xml:space="preserve">, </w:t>
+            </w:r>
+            <w:proofErr w:type="spellStart"/>
+            <w:r>
+              <w:t>tanpa</w:t>
+            </w:r>
+            <w:proofErr w:type="spellEnd"/>
+            <w:r>
+              <w:t xml:space="preserve"> </w:t>
+            </w:r>
+            <w:proofErr w:type="spellStart"/>
+            <w:r>
+              <w:t>memasang</w:t>
+            </w:r>
+            <w:proofErr w:type="spellEnd"/>
+            <w:r>
+              <w:t xml:space="preserve"> </w:t>
+            </w:r>
+            <w:proofErr w:type="spellStart"/>
+            <w:r>
+              <w:t>pendengar</w:t>
+            </w:r>
+            <w:proofErr w:type="spellEnd"/>
+            <w:r>
+              <w:t xml:space="preserve"> pada </w:t>
+            </w:r>
+            <w:proofErr w:type="spellStart"/>
+            <w:r>
+              <w:t>setiap</w:t>
+            </w:r>
+            <w:proofErr w:type="spellEnd"/>
+            <w:r>
+              <w:t xml:space="preserve"> </w:t>
+            </w:r>
+            <w:proofErr w:type="spellStart"/>
+            <w:r>
+              <w:t>tombol</w:t>
+            </w:r>
+            <w:proofErr w:type="spellEnd"/>
+            <w:r>
+              <w:t>.</w:t>
+            </w:r>
+          </w:p>
         </w:tc>
       </w:tr>
       <w:tr>
@@ -12320,7 +12883,38 @@
               <w:right w:val="single" w:sz="4" w:space="0" w:color="B9C6E2"/>
             </w:tcBorders>
           </w:tcPr>
-          <w:p/>
+          <w:p>
+            <w:r>
+              <w:t xml:space="preserve">Bukti </w:t>
+            </w:r>
+            <w:proofErr w:type="spellStart"/>
+            <w:r>
+              <w:t>ada</w:t>
+            </w:r>
+            <w:proofErr w:type="spellEnd"/>
+            <w:r>
+              <w:t xml:space="preserve"> pada</w:t>
+            </w:r>
+            <w:r>
+              <w:t xml:space="preserve"> </w:t>
+            </w:r>
+            <w:proofErr w:type="spellStart"/>
+            <w:r>
+              <w:t>barisFilter.addEventListener</w:t>
+            </w:r>
+            <w:proofErr w:type="spellEnd"/>
+            <w:r>
+              <w:t xml:space="preserve">("click", ...) dan </w:t>
+            </w:r>
+            <w:proofErr w:type="spellStart"/>
+            <w:r>
+              <w:t>event.target.closest</w:t>
+            </w:r>
+            <w:proofErr w:type="spellEnd"/>
+            <w:r>
+              <w:t>("button")</w:t>
+            </w:r>
+          </w:p>
         </w:tc>
       </w:tr>
     </w:tbl>
@@ -12427,7 +13021,313 @@
               <w:right w:val="single" w:sz="4" w:space="0" w:color="B9C6E2"/>
             </w:tcBorders>
           </w:tcPr>
-          <w:p/>
+          <w:p>
+            <w:r>
+              <w:t xml:space="preserve">Jika baris </w:t>
+            </w:r>
+            <w:proofErr w:type="spellStart"/>
+            <w:r>
+              <w:t>wadah.textContent</w:t>
+            </w:r>
+            <w:proofErr w:type="spellEnd"/>
+            <w:r>
+              <w:t xml:space="preserve"> = ""; </w:t>
+            </w:r>
+            <w:proofErr w:type="spellStart"/>
+            <w:r>
+              <w:t>dihapus</w:t>
+            </w:r>
+            <w:proofErr w:type="spellEnd"/>
+            <w:r>
+              <w:t xml:space="preserve">, </w:t>
+            </w:r>
+            <w:proofErr w:type="spellStart"/>
+            <w:r>
+              <w:t>elemen</w:t>
+            </w:r>
+            <w:proofErr w:type="spellEnd"/>
+            <w:r>
+              <w:t xml:space="preserve"> </w:t>
+            </w:r>
+            <w:proofErr w:type="spellStart"/>
+            <w:r>
+              <w:t>proyek</w:t>
+            </w:r>
+            <w:proofErr w:type="spellEnd"/>
+            <w:r>
+              <w:t xml:space="preserve"> yang </w:t>
+            </w:r>
+            <w:proofErr w:type="spellStart"/>
+            <w:r>
+              <w:t>sudah</w:t>
+            </w:r>
+            <w:proofErr w:type="spellEnd"/>
+            <w:r>
+              <w:t xml:space="preserve"> </w:t>
+            </w:r>
+            <w:proofErr w:type="spellStart"/>
+            <w:r>
+              <w:t>ditampilkan</w:t>
+            </w:r>
+            <w:proofErr w:type="spellEnd"/>
+            <w:r>
+              <w:t xml:space="preserve"> </w:t>
+            </w:r>
+            <w:proofErr w:type="spellStart"/>
+            <w:r>
+              <w:t>tidak</w:t>
+            </w:r>
+            <w:proofErr w:type="spellEnd"/>
+            <w:r>
+              <w:t xml:space="preserve"> </w:t>
+            </w:r>
+            <w:proofErr w:type="spellStart"/>
+            <w:r>
+              <w:t>tewr</w:t>
+            </w:r>
+            <w:r>
+              <w:t>hapus</w:t>
+            </w:r>
+            <w:proofErr w:type="spellEnd"/>
+            <w:r>
+              <w:t xml:space="preserve"> </w:t>
+            </w:r>
+            <w:proofErr w:type="spellStart"/>
+            <w:r>
+              <w:t>sebelum</w:t>
+            </w:r>
+            <w:proofErr w:type="spellEnd"/>
+            <w:r>
+              <w:t xml:space="preserve"> </w:t>
+            </w:r>
+            <w:proofErr w:type="spellStart"/>
+            <w:r>
+              <w:t>hasil</w:t>
+            </w:r>
+            <w:proofErr w:type="spellEnd"/>
+            <w:r>
+              <w:t xml:space="preserve"> </w:t>
+            </w:r>
+            <w:proofErr w:type="spellStart"/>
+            <w:r>
+              <w:t>penyaringan</w:t>
+            </w:r>
+            <w:proofErr w:type="spellEnd"/>
+            <w:r>
+              <w:t xml:space="preserve"> </w:t>
+            </w:r>
+            <w:proofErr w:type="spellStart"/>
+            <w:r>
+              <w:t>ditambahkan</w:t>
+            </w:r>
+            <w:proofErr w:type="spellEnd"/>
+            <w:r>
+              <w:t xml:space="preserve">. </w:t>
+            </w:r>
+            <w:proofErr w:type="spellStart"/>
+            <w:r>
+              <w:t>proyek</w:t>
+            </w:r>
+            <w:proofErr w:type="spellEnd"/>
+            <w:r>
+              <w:t xml:space="preserve"> lama </w:t>
+            </w:r>
+            <w:proofErr w:type="spellStart"/>
+            <w:r>
+              <w:t>tetap</w:t>
+            </w:r>
+            <w:proofErr w:type="spellEnd"/>
+            <w:r>
+              <w:t xml:space="preserve"> </w:t>
+            </w:r>
+            <w:proofErr w:type="spellStart"/>
+            <w:r>
+              <w:t>tampil</w:t>
+            </w:r>
+            <w:proofErr w:type="spellEnd"/>
+            <w:r>
+              <w:t xml:space="preserve"> dan </w:t>
+            </w:r>
+            <w:proofErr w:type="spellStart"/>
+            <w:r>
+              <w:t>proyek</w:t>
+            </w:r>
+            <w:proofErr w:type="spellEnd"/>
+            <w:r>
+              <w:t xml:space="preserve"> </w:t>
+            </w:r>
+            <w:proofErr w:type="spellStart"/>
+            <w:r>
+              <w:t>hasil</w:t>
+            </w:r>
+            <w:proofErr w:type="spellEnd"/>
+            <w:r>
+              <w:t xml:space="preserve"> </w:t>
+            </w:r>
+            <w:proofErr w:type="spellStart"/>
+            <w:r>
+              <w:t>penyaringan</w:t>
+            </w:r>
+            <w:proofErr w:type="spellEnd"/>
+            <w:r>
+              <w:t xml:space="preserve"> </w:t>
+            </w:r>
+            <w:proofErr w:type="spellStart"/>
+            <w:r>
+              <w:t>ditambahkan</w:t>
+            </w:r>
+            <w:proofErr w:type="spellEnd"/>
+            <w:r>
+              <w:t xml:space="preserve"> di </w:t>
+            </w:r>
+            <w:proofErr w:type="spellStart"/>
+            <w:r>
+              <w:t>bawahnya</w:t>
+            </w:r>
+            <w:proofErr w:type="spellEnd"/>
+            <w:r>
+              <w:t xml:space="preserve"> </w:t>
+            </w:r>
+            <w:proofErr w:type="spellStart"/>
+            <w:r>
+              <w:t>sehingga</w:t>
+            </w:r>
+            <w:proofErr w:type="spellEnd"/>
+            <w:r>
+              <w:t xml:space="preserve"> daftar </w:t>
+            </w:r>
+            <w:proofErr w:type="spellStart"/>
+            <w:r>
+              <w:t>dapat</w:t>
+            </w:r>
+            <w:proofErr w:type="spellEnd"/>
+            <w:r>
+              <w:t xml:space="preserve"> </w:t>
+            </w:r>
+            <w:proofErr w:type="spellStart"/>
+            <w:r>
+              <w:t>ter</w:t>
+            </w:r>
+            <w:r>
+              <w:t>duplikasi</w:t>
+            </w:r>
+            <w:proofErr w:type="spellEnd"/>
+            <w:r>
+              <w:t>. Co</w:t>
+            </w:r>
+            <w:proofErr w:type="spellStart"/>
+            <w:r>
+              <w:t>ntohnya</w:t>
+            </w:r>
+            <w:proofErr w:type="spellEnd"/>
+            <w:r>
+              <w:t xml:space="preserve">, </w:t>
+            </w:r>
+            <w:proofErr w:type="spellStart"/>
+            <w:r>
+              <w:t>saat</w:t>
+            </w:r>
+            <w:proofErr w:type="spellEnd"/>
+            <w:r>
+              <w:t xml:space="preserve"> </w:t>
+            </w:r>
+            <w:proofErr w:type="spellStart"/>
+            <w:r>
+              <w:t>tombol</w:t>
+            </w:r>
+            <w:proofErr w:type="spellEnd"/>
+            <w:r>
+              <w:t xml:space="preserve"> </w:t>
+            </w:r>
+            <w:proofErr w:type="spellStart"/>
+            <w:r>
+              <w:t>kategori</w:t>
+            </w:r>
+            <w:proofErr w:type="spellEnd"/>
+            <w:r>
+              <w:t xml:space="preserve"> “web” </w:t>
+            </w:r>
+            <w:proofErr w:type="spellStart"/>
+            <w:r>
+              <w:t>diklik</w:t>
+            </w:r>
+            <w:proofErr w:type="spellEnd"/>
+            <w:r>
+              <w:t xml:space="preserve">, </w:t>
+            </w:r>
+            <w:proofErr w:type="spellStart"/>
+            <w:r>
+              <w:t>proyek</w:t>
+            </w:r>
+            <w:proofErr w:type="spellEnd"/>
+            <w:r>
+              <w:t xml:space="preserve"> “Stress Shield” dan “</w:t>
+            </w:r>
+            <w:proofErr w:type="spellStart"/>
+            <w:r>
+              <w:t>KisahSiKecil</w:t>
+            </w:r>
+            <w:proofErr w:type="spellEnd"/>
+            <w:r>
+              <w:t xml:space="preserve">” </w:t>
+            </w:r>
+            <w:proofErr w:type="spellStart"/>
+            <w:r>
+              <w:t>ditambahkan</w:t>
+            </w:r>
+            <w:proofErr w:type="spellEnd"/>
+            <w:r>
+              <w:t xml:space="preserve"> </w:t>
+            </w:r>
+            <w:proofErr w:type="spellStart"/>
+            <w:r>
+              <w:t>tanpa</w:t>
+            </w:r>
+            <w:proofErr w:type="spellEnd"/>
+            <w:r>
+              <w:t xml:space="preserve"> </w:t>
+            </w:r>
+            <w:proofErr w:type="spellStart"/>
+            <w:r>
+              <w:t>menghapus</w:t>
+            </w:r>
+            <w:proofErr w:type="spellEnd"/>
+            <w:r>
+              <w:t xml:space="preserve"> </w:t>
+            </w:r>
+            <w:proofErr w:type="spellStart"/>
+            <w:r>
+              <w:t>proyek</w:t>
+            </w:r>
+            <w:proofErr w:type="spellEnd"/>
+            <w:r>
+              <w:t xml:space="preserve"> “</w:t>
+            </w:r>
+            <w:proofErr w:type="spellStart"/>
+            <w:r>
+              <w:t>WarMis</w:t>
+            </w:r>
+            <w:proofErr w:type="spellEnd"/>
+            <w:r>
+              <w:t xml:space="preserve">” yang </w:t>
+            </w:r>
+            <w:proofErr w:type="spellStart"/>
+            <w:r>
+              <w:t>sudah</w:t>
+            </w:r>
+            <w:proofErr w:type="spellEnd"/>
+            <w:r>
+              <w:t xml:space="preserve"> </w:t>
+            </w:r>
+            <w:proofErr w:type="spellStart"/>
+            <w:r>
+              <w:t>ada</w:t>
+            </w:r>
+            <w:proofErr w:type="spellEnd"/>
+            <w:r>
+              <w:t>.</w:t>
+            </w:r>
+          </w:p>
         </w:tc>
       </w:tr>
       <w:tr>
@@ -12502,11 +13402,55 @@
             </w:pPr>
             <w:r>
               <w:rPr>
-                <w:rFonts w:cs="Carlito"/>
+                <w:rFonts w:ascii="Segoe UI Symbol" w:hAnsi="Segoe UI Symbol" w:cs="Segoe UI Symbol"/>
                 <w:color w:val="003796"/>
                 <w:sz w:val="22"/>
               </w:rPr>
-              <w:t>☐  Berkas  profil.html, seluruh CSS, js/app.js, dan js/dom.js ada di repositori dan terbuka tanpa galat di Console</w:t>
+              <w:t>✔</w:t>
+            </w:r>
+            <w:r>
+              <w:rPr>
+                <w:rFonts w:cs="Carlito"/>
+                <w:color w:val="003796"/>
+                <w:sz w:val="22"/>
+              </w:rPr>
+              <w:t xml:space="preserve">  </w:t>
+            </w:r>
+            <w:proofErr w:type="spellStart"/>
+            <w:r>
+              <w:rPr>
+                <w:rFonts w:cs="Carlito"/>
+                <w:color w:val="003796"/>
+                <w:sz w:val="22"/>
+              </w:rPr>
+              <w:t>Berkas</w:t>
+            </w:r>
+            <w:proofErr w:type="spellEnd"/>
+            <w:r>
+              <w:rPr>
+                <w:rFonts w:cs="Carlito"/>
+                <w:color w:val="003796"/>
+                <w:sz w:val="22"/>
+              </w:rPr>
+              <w:t xml:space="preserve">  profil.html, </w:t>
+            </w:r>
+            <w:proofErr w:type="spellStart"/>
+            <w:r>
+              <w:rPr>
+                <w:rFonts w:cs="Carlito"/>
+                <w:color w:val="003796"/>
+                <w:sz w:val="22"/>
+              </w:rPr>
+              <w:t>seluruh</w:t>
+            </w:r>
+            <w:proofErr w:type="spellEnd"/>
+            <w:r>
+              <w:rPr>
+                <w:rFonts w:cs="Carlito"/>
+                <w:color w:val="003796"/>
+                <w:sz w:val="22"/>
+              </w:rPr>
+              <w:t xml:space="preserve"> CSS, js/app.js, dan js/dom.js ada di repositori dan terbuka tanpa galat di Console</w:t>
             </w:r>
           </w:p>
         </w:tc>
@@ -12528,11 +13472,74 @@
             </w:pPr>
             <w:r>
               <w:rPr>
-                <w:rFonts w:cs="Carlito"/>
+                <w:rFonts w:ascii="Segoe UI Symbol" w:hAnsi="Segoe UI Symbol" w:cs="Segoe UI Symbol"/>
                 <w:color w:val="003796"/>
                 <w:sz w:val="22"/>
               </w:rPr>
-              <w:t>☐  Pemilih  setiap pemilih menghasilkan elemen; tidak ada satu pun yang bernilai null</w:t>
+              <w:lastRenderedPageBreak/>
+              <w:t>✔</w:t>
+            </w:r>
+            <w:r>
+              <w:rPr>
+                <w:rFonts w:cs="Carlito"/>
+                <w:color w:val="003796"/>
+                <w:sz w:val="22"/>
+              </w:rPr>
+              <w:t xml:space="preserve">  </w:t>
+            </w:r>
+            <w:proofErr w:type="spellStart"/>
+            <w:r>
+              <w:rPr>
+                <w:rFonts w:cs="Carlito"/>
+                <w:color w:val="003796"/>
+                <w:sz w:val="22"/>
+              </w:rPr>
+              <w:t>Pemilih</w:t>
+            </w:r>
+            <w:proofErr w:type="spellEnd"/>
+            <w:r>
+              <w:rPr>
+                <w:rFonts w:cs="Carlito"/>
+                <w:color w:val="003796"/>
+                <w:sz w:val="22"/>
+              </w:rPr>
+              <w:t xml:space="preserve">  </w:t>
+            </w:r>
+            <w:proofErr w:type="spellStart"/>
+            <w:r>
+              <w:rPr>
+                <w:rFonts w:cs="Carlito"/>
+                <w:color w:val="003796"/>
+                <w:sz w:val="22"/>
+              </w:rPr>
+              <w:t>setiap</w:t>
+            </w:r>
+            <w:proofErr w:type="spellEnd"/>
+            <w:r>
+              <w:rPr>
+                <w:rFonts w:cs="Carlito"/>
+                <w:color w:val="003796"/>
+                <w:sz w:val="22"/>
+              </w:rPr>
+              <w:t xml:space="preserve"> </w:t>
+            </w:r>
+            <w:proofErr w:type="spellStart"/>
+            <w:r>
+              <w:rPr>
+                <w:rFonts w:cs="Carlito"/>
+                <w:color w:val="003796"/>
+                <w:sz w:val="22"/>
+              </w:rPr>
+              <w:t>pemilih</w:t>
+            </w:r>
+            <w:proofErr w:type="spellEnd"/>
+            <w:r>
+              <w:rPr>
+                <w:rFonts w:cs="Carlito"/>
+                <w:color w:val="003796"/>
+                <w:sz w:val="22"/>
+              </w:rPr>
+              <w:t xml:space="preserve"> menghasilkan elemen; tidak ada satu pun yang bernilai null</w:t>
             </w:r>
           </w:p>
         </w:tc>
@@ -12554,11 +13561,37 @@
             </w:pPr>
             <w:r>
               <w:rPr>
-                <w:rFonts w:cs="Carlito"/>
+                <w:rFonts w:ascii="Segoe UI Symbol" w:hAnsi="Segoe UI Symbol" w:cs="Segoe UI Symbol"/>
                 <w:color w:val="003796"/>
                 <w:sz w:val="22"/>
               </w:rPr>
-              <w:t>☐  Render dari data  daftar proyek terbentuk dari array dengan createElement dan textContent, bukan dari HTML yang ditulis tangan</w:t>
+              <w:t>✔</w:t>
+            </w:r>
+            <w:r>
+              <w:rPr>
+                <w:rFonts w:cs="Carlito"/>
+                <w:color w:val="003796"/>
+                <w:sz w:val="22"/>
+              </w:rPr>
+              <w:t xml:space="preserve">  Render </w:t>
+            </w:r>
+            <w:proofErr w:type="spellStart"/>
+            <w:r>
+              <w:rPr>
+                <w:rFonts w:cs="Carlito"/>
+                <w:color w:val="003796"/>
+                <w:sz w:val="22"/>
+              </w:rPr>
+              <w:t>dari</w:t>
+            </w:r>
+            <w:proofErr w:type="spellEnd"/>
+            <w:r>
+              <w:rPr>
+                <w:rFonts w:cs="Carlito"/>
+                <w:color w:val="003796"/>
+                <w:sz w:val="22"/>
+              </w:rPr>
+              <w:t xml:space="preserve"> data  daftar proyek terbentuk dari array dengan createElement dan textContent, bukan dari HTML yang ditulis tangan</w:t>
             </w:r>
           </w:p>
         </w:tc>
@@ -12580,11 +13613,37 @@
             </w:pPr>
             <w:r>
               <w:rPr>
-                <w:rFonts w:cs="Carlito"/>
+                <w:rFonts w:ascii="Segoe UI Symbol" w:hAnsi="Segoe UI Symbol" w:cs="Segoe UI Symbol"/>
                 <w:color w:val="003796"/>
                 <w:sz w:val="22"/>
               </w:rPr>
-              <w:t>☐  Wadah  dikosongkan di baris pertama fungsi render, sehingga kartu tidak pernah berlipat</w:t>
+              <w:t>✔</w:t>
+            </w:r>
+            <w:r>
+              <w:rPr>
+                <w:rFonts w:cs="Carlito"/>
+                <w:color w:val="003796"/>
+                <w:sz w:val="22"/>
+              </w:rPr>
+              <w:t xml:space="preserve">  Wadah  </w:t>
+            </w:r>
+            <w:proofErr w:type="spellStart"/>
+            <w:r>
+              <w:rPr>
+                <w:rFonts w:cs="Carlito"/>
+                <w:color w:val="003796"/>
+                <w:sz w:val="22"/>
+              </w:rPr>
+              <w:t>dikosongkan</w:t>
+            </w:r>
+            <w:proofErr w:type="spellEnd"/>
+            <w:r>
+              <w:rPr>
+                <w:rFonts w:cs="Carlito"/>
+                <w:color w:val="003796"/>
+                <w:sz w:val="22"/>
+              </w:rPr>
+              <w:t xml:space="preserve"> di baris pertama fungsi render, sehingga kartu tidak pernah berlipat</w:t>
             </w:r>
           </w:p>
         </w:tc>
@@ -12606,11 +13665,37 @@
             </w:pPr>
             <w:r>
               <w:rPr>
-                <w:rFonts w:cs="Carlito"/>
+                <w:rFonts w:ascii="Segoe UI Symbol" w:hAnsi="Segoe UI Symbol" w:cs="Segoe UI Symbol"/>
                 <w:color w:val="003796"/>
                 <w:sz w:val="22"/>
               </w:rPr>
-              <w:t>☐  Event delegation  satu pendengar di induk melayani semua tombol filter; event.target dan closest dipakai benar</w:t>
+              <w:t>✔</w:t>
+            </w:r>
+            <w:r>
+              <w:rPr>
+                <w:rFonts w:cs="Carlito"/>
+                <w:color w:val="003796"/>
+                <w:sz w:val="22"/>
+              </w:rPr>
+              <w:t xml:space="preserve">  Event delegation  </w:t>
+            </w:r>
+            <w:proofErr w:type="spellStart"/>
+            <w:r>
+              <w:rPr>
+                <w:rFonts w:cs="Carlito"/>
+                <w:color w:val="003796"/>
+                <w:sz w:val="22"/>
+              </w:rPr>
+              <w:t>satu</w:t>
+            </w:r>
+            <w:proofErr w:type="spellEnd"/>
+            <w:r>
+              <w:rPr>
+                <w:rFonts w:cs="Carlito"/>
+                <w:color w:val="003796"/>
+                <w:sz w:val="22"/>
+              </w:rPr>
+              <w:t xml:space="preserve"> pendengar di induk melayani semua tombol filter; event.target dan closest dipakai benar</w:t>
             </w:r>
           </w:p>
         </w:tc>
@@ -12632,11 +13717,73 @@
             </w:pPr>
             <w:r>
               <w:rPr>
-                <w:rFonts w:cs="Carlito"/>
+                <w:rFonts w:ascii="Segoe UI Symbol" w:hAnsi="Segoe UI Symbol" w:cs="Segoe UI Symbol"/>
                 <w:color w:val="003796"/>
                 <w:sz w:val="22"/>
               </w:rPr>
-              <w:t>☐  Keadaan kosong  halaman menampilkan pesan ketika penyaringan tidak menghasilkan isi</w:t>
+              <w:t>✔</w:t>
+            </w:r>
+            <w:r>
+              <w:rPr>
+                <w:rFonts w:cs="Carlito"/>
+                <w:color w:val="003796"/>
+                <w:sz w:val="22"/>
+              </w:rPr>
+              <w:t xml:space="preserve">  </w:t>
+            </w:r>
+            <w:proofErr w:type="spellStart"/>
+            <w:r>
+              <w:rPr>
+                <w:rFonts w:cs="Carlito"/>
+                <w:color w:val="003796"/>
+                <w:sz w:val="22"/>
+              </w:rPr>
+              <w:t>Keadaan</w:t>
+            </w:r>
+            <w:proofErr w:type="spellEnd"/>
+            <w:r>
+              <w:rPr>
+                <w:rFonts w:cs="Carlito"/>
+                <w:color w:val="003796"/>
+                <w:sz w:val="22"/>
+              </w:rPr>
+              <w:t xml:space="preserve"> </w:t>
+            </w:r>
+            <w:proofErr w:type="spellStart"/>
+            <w:r>
+              <w:rPr>
+                <w:rFonts w:cs="Carlito"/>
+                <w:color w:val="003796"/>
+                <w:sz w:val="22"/>
+              </w:rPr>
+              <w:t>kosong</w:t>
+            </w:r>
+            <w:proofErr w:type="spellEnd"/>
+            <w:r>
+              <w:rPr>
+                <w:rFonts w:cs="Carlito"/>
+                <w:color w:val="003796"/>
+                <w:sz w:val="22"/>
+              </w:rPr>
+              <w:t xml:space="preserve">  </w:t>
+            </w:r>
+            <w:proofErr w:type="spellStart"/>
+            <w:r>
+              <w:rPr>
+                <w:rFonts w:cs="Carlito"/>
+                <w:color w:val="003796"/>
+                <w:sz w:val="22"/>
+              </w:rPr>
+              <w:t>halaman</w:t>
+            </w:r>
+            <w:proofErr w:type="spellEnd"/>
+            <w:r>
+              <w:rPr>
+                <w:rFonts w:cs="Carlito"/>
+                <w:color w:val="003796"/>
+                <w:sz w:val="22"/>
+              </w:rPr>
+              <w:t xml:space="preserve"> menampilkan pesan ketika penyaringan tidak menghasilkan isi</w:t>
             </w:r>
           </w:p>
         </w:tc>
@@ -12658,12 +13805,55 @@
             </w:pPr>
             <w:r>
               <w:rPr>
-                <w:rFonts w:cs="Carlito"/>
+                <w:rFonts w:ascii="Segoe UI Symbol" w:hAnsi="Segoe UI Symbol" w:cs="Segoe UI Symbol"/>
                 <w:color w:val="003796"/>
                 <w:sz w:val="22"/>
               </w:rPr>
-              <w:lastRenderedPageBreak/>
-              <w:t>☐  Validasi form  halaman tidak dimuat ulang, pesan galat muncul per kolom, dan tombol kirim menunggu sampai isinya layak</w:t>
+              <w:t>✔</w:t>
+            </w:r>
+            <w:r>
+              <w:rPr>
+                <w:rFonts w:cs="Carlito"/>
+                <w:color w:val="003796"/>
+                <w:sz w:val="22"/>
+              </w:rPr>
+              <w:t xml:space="preserve">  </w:t>
+            </w:r>
+            <w:proofErr w:type="spellStart"/>
+            <w:r>
+              <w:rPr>
+                <w:rFonts w:cs="Carlito"/>
+                <w:color w:val="003796"/>
+                <w:sz w:val="22"/>
+              </w:rPr>
+              <w:t>Validasi</w:t>
+            </w:r>
+            <w:proofErr w:type="spellEnd"/>
+            <w:r>
+              <w:rPr>
+                <w:rFonts w:cs="Carlito"/>
+                <w:color w:val="003796"/>
+                <w:sz w:val="22"/>
+              </w:rPr>
+              <w:t xml:space="preserve"> form  </w:t>
+            </w:r>
+            <w:proofErr w:type="spellStart"/>
+            <w:r>
+              <w:rPr>
+                <w:rFonts w:cs="Carlito"/>
+                <w:color w:val="003796"/>
+                <w:sz w:val="22"/>
+              </w:rPr>
+              <w:t>halaman</w:t>
+            </w:r>
+            <w:proofErr w:type="spellEnd"/>
+            <w:r>
+              <w:rPr>
+                <w:rFonts w:cs="Carlito"/>
+                <w:color w:val="003796"/>
+                <w:sz w:val="22"/>
+              </w:rPr>
+              <w:t xml:space="preserve"> tidak dimuat ulang, pesan galat muncul per kolom, dan tombol kirim menunggu sampai isinya layak</w:t>
             </w:r>
           </w:p>
         </w:tc>
@@ -12685,11 +13875,55 @@
             </w:pPr>
             <w:r>
               <w:rPr>
-                <w:rFonts w:cs="Carlito"/>
+                <w:rFonts w:ascii="Segoe UI Symbol" w:hAnsi="Segoe UI Symbol" w:cs="Segoe UI Symbol"/>
                 <w:color w:val="003796"/>
                 <w:sz w:val="22"/>
               </w:rPr>
-              <w:t>☐  Deklarasi AI  bagian README menyebutkan bagian mana yang dibantu AI dan bagian mana yang Anda kerjakan sendiri</w:t>
+              <w:t>✔</w:t>
+            </w:r>
+            <w:r>
+              <w:rPr>
+                <w:rFonts w:cs="Carlito"/>
+                <w:color w:val="003796"/>
+                <w:sz w:val="22"/>
+              </w:rPr>
+              <w:t xml:space="preserve">  </w:t>
+            </w:r>
+            <w:proofErr w:type="spellStart"/>
+            <w:r>
+              <w:rPr>
+                <w:rFonts w:cs="Carlito"/>
+                <w:color w:val="003796"/>
+                <w:sz w:val="22"/>
+              </w:rPr>
+              <w:t>Deklarasi</w:t>
+            </w:r>
+            <w:proofErr w:type="spellEnd"/>
+            <w:r>
+              <w:rPr>
+                <w:rFonts w:cs="Carlito"/>
+                <w:color w:val="003796"/>
+                <w:sz w:val="22"/>
+              </w:rPr>
+              <w:t xml:space="preserve"> AI  </w:t>
+            </w:r>
+            <w:proofErr w:type="spellStart"/>
+            <w:r>
+              <w:rPr>
+                <w:rFonts w:cs="Carlito"/>
+                <w:color w:val="003796"/>
+                <w:sz w:val="22"/>
+              </w:rPr>
+              <w:t>bagian</w:t>
+            </w:r>
+            <w:proofErr w:type="spellEnd"/>
+            <w:r>
+              <w:rPr>
+                <w:rFonts w:cs="Carlito"/>
+                <w:color w:val="003796"/>
+                <w:sz w:val="22"/>
+              </w:rPr>
+              <w:t xml:space="preserve"> README menyebutkan bagian mana yang dibantu AI dan bagian mana yang Anda kerjakan sendiri</w:t>
             </w:r>
           </w:p>
         </w:tc>
@@ -12711,11 +13945,55 @@
             </w:pPr>
             <w:r>
               <w:rPr>
-                <w:rFonts w:cs="Carlito"/>
+                <w:rFonts w:ascii="Segoe UI Symbol" w:hAnsi="Segoe UI Symbol" w:cs="Segoe UI Symbol"/>
                 <w:color w:val="003796"/>
                 <w:sz w:val="22"/>
               </w:rPr>
-              <w:t>☐  Git  ada lebih dari satu commit hari ini, dan pesan commit-nya menjelaskan isinya</w:t>
+              <w:t>✔</w:t>
+            </w:r>
+            <w:r>
+              <w:rPr>
+                <w:rFonts w:cs="Carlito"/>
+                <w:color w:val="003796"/>
+                <w:sz w:val="22"/>
+              </w:rPr>
+              <w:t xml:space="preserve">  Git  </w:t>
+            </w:r>
+            <w:proofErr w:type="spellStart"/>
+            <w:r>
+              <w:rPr>
+                <w:rFonts w:cs="Carlito"/>
+                <w:color w:val="003796"/>
+                <w:sz w:val="22"/>
+              </w:rPr>
+              <w:t>ada</w:t>
+            </w:r>
+            <w:proofErr w:type="spellEnd"/>
+            <w:r>
+              <w:rPr>
+                <w:rFonts w:cs="Carlito"/>
+                <w:color w:val="003796"/>
+                <w:sz w:val="22"/>
+              </w:rPr>
+              <w:t xml:space="preserve"> </w:t>
+            </w:r>
+            <w:proofErr w:type="spellStart"/>
+            <w:r>
+              <w:rPr>
+                <w:rFonts w:cs="Carlito"/>
+                <w:color w:val="003796"/>
+                <w:sz w:val="22"/>
+              </w:rPr>
+              <w:t>lebih</w:t>
+            </w:r>
+            <w:proofErr w:type="spellEnd"/>
+            <w:r>
+              <w:rPr>
+                <w:rFonts w:cs="Carlito"/>
+                <w:color w:val="003796"/>
+                <w:sz w:val="22"/>
+              </w:rPr>
+              <w:t xml:space="preserve"> dari satu commit hari ini, dan pesan commit-nya menjelaskan isinya</w:t>
             </w:r>
           </w:p>
         </w:tc>
@@ -13751,7 +15029,6 @@
                 <w:color w:val="E2E8F0"/>
                 <w:sz w:val="17"/>
               </w:rPr>
-              <w:lastRenderedPageBreak/>
               <w:t>git add .</w:t>
             </w:r>
             <w:r>
@@ -15035,6 +16312,65 @@
             <w:pPr>
               <w:spacing w:before="20" w:after="20" w:line="252" w:lineRule="auto"/>
             </w:pPr>
+            <w:r>
+              <w:t xml:space="preserve">Saat </w:t>
+            </w:r>
+            <w:proofErr w:type="spellStart"/>
+            <w:r>
+              <w:t>ingin</w:t>
+            </w:r>
+            <w:proofErr w:type="spellEnd"/>
+            <w:r>
+              <w:t xml:space="preserve"> </w:t>
+            </w:r>
+            <w:proofErr w:type="spellStart"/>
+            <w:r>
+              <w:t>mengambil</w:t>
+            </w:r>
+            <w:proofErr w:type="spellEnd"/>
+            <w:r>
+              <w:t xml:space="preserve"> </w:t>
+            </w:r>
+            <w:proofErr w:type="spellStart"/>
+            <w:r>
+              <w:t>elemen</w:t>
+            </w:r>
+            <w:proofErr w:type="spellEnd"/>
+            <w:r>
+              <w:t xml:space="preserve"> </w:t>
+            </w:r>
+            <w:proofErr w:type="spellStart"/>
+            <w:r>
+              <w:t>tertentu</w:t>
+            </w:r>
+            <w:proofErr w:type="spellEnd"/>
+            <w:r>
+              <w:t xml:space="preserve">, </w:t>
+            </w:r>
+            <w:proofErr w:type="spellStart"/>
+            <w:r>
+              <w:t>seperti</w:t>
+            </w:r>
+            <w:proofErr w:type="spellEnd"/>
+            <w:r>
+              <w:t xml:space="preserve"> </w:t>
+            </w:r>
+            <w:proofErr w:type="spellStart"/>
+            <w:r>
+              <w:t>wadah</w:t>
+            </w:r>
+            <w:proofErr w:type="spellEnd"/>
+            <w:r>
+              <w:t xml:space="preserve"> daftar </w:t>
+            </w:r>
+            <w:proofErr w:type="spellStart"/>
+            <w:r>
+              <w:t>proyek</w:t>
+            </w:r>
+            <w:proofErr w:type="spellEnd"/>
+            <w:r>
+              <w:t xml:space="preserve"> #daftar</w:t>
+            </w:r>
           </w:p>
         </w:tc>
       </w:tr>
@@ -15104,6 +16440,73 @@
             <w:pPr>
               <w:spacing w:before="20" w:after="20" w:line="252" w:lineRule="auto"/>
             </w:pPr>
+            <w:r>
+              <w:t xml:space="preserve">Saat </w:t>
+            </w:r>
+            <w:proofErr w:type="spellStart"/>
+            <w:r>
+              <w:t>ingin</w:t>
+            </w:r>
+            <w:proofErr w:type="spellEnd"/>
+            <w:r>
+              <w:t xml:space="preserve"> </w:t>
+            </w:r>
+            <w:proofErr w:type="spellStart"/>
+            <w:r>
+              <w:t>memilih</w:t>
+            </w:r>
+            <w:proofErr w:type="spellEnd"/>
+            <w:r>
+              <w:t xml:space="preserve"> </w:t>
+            </w:r>
+            <w:proofErr w:type="spellStart"/>
+            <w:r>
+              <w:t>beberapa</w:t>
+            </w:r>
+            <w:proofErr w:type="spellEnd"/>
+            <w:r>
+              <w:t xml:space="preserve"> </w:t>
+            </w:r>
+            <w:proofErr w:type="spellStart"/>
+            <w:r>
+              <w:t>elemen</w:t>
+            </w:r>
+            <w:proofErr w:type="spellEnd"/>
+            <w:r>
+              <w:t xml:space="preserve"> </w:t>
+            </w:r>
+            <w:proofErr w:type="spellStart"/>
+            <w:r>
+              <w:t>sekaligus</w:t>
+            </w:r>
+            <w:proofErr w:type="spellEnd"/>
+            <w:r>
+              <w:t xml:space="preserve">, </w:t>
+            </w:r>
+            <w:proofErr w:type="spellStart"/>
+            <w:r>
+              <w:t>misalnya</w:t>
+            </w:r>
+            <w:proofErr w:type="spellEnd"/>
+            <w:r>
+              <w:t xml:space="preserve"> </w:t>
+            </w:r>
+            <w:proofErr w:type="spellStart"/>
+            <w:r>
+              <w:t>semua</w:t>
+            </w:r>
+            <w:proofErr w:type="spellEnd"/>
+            <w:r>
+              <w:t xml:space="preserve"> </w:t>
+            </w:r>
+            <w:proofErr w:type="spellStart"/>
+            <w:r>
+              <w:t>tombol</w:t>
+            </w:r>
+            <w:proofErr w:type="spellEnd"/>
+            <w:r>
+              <w:t xml:space="preserve"> filter.</w:t>
+            </w:r>
           </w:p>
         </w:tc>
       </w:tr>
@@ -15173,6 +16576,57 @@
             <w:pPr>
               <w:spacing w:before="20" w:after="20" w:line="252" w:lineRule="auto"/>
             </w:pPr>
+            <w:r>
+              <w:t xml:space="preserve">Saat </w:t>
+            </w:r>
+            <w:proofErr w:type="spellStart"/>
+            <w:r>
+              <w:t>ingin</w:t>
+            </w:r>
+            <w:proofErr w:type="spellEnd"/>
+            <w:r>
+              <w:t xml:space="preserve"> </w:t>
+            </w:r>
+            <w:proofErr w:type="spellStart"/>
+            <w:r>
+              <w:t>menggunakan</w:t>
+            </w:r>
+            <w:proofErr w:type="spellEnd"/>
+            <w:r>
+              <w:t xml:space="preserve"> </w:t>
+            </w:r>
+            <w:proofErr w:type="spellStart"/>
+            <w:r>
+              <w:t>metode</w:t>
+            </w:r>
+            <w:proofErr w:type="spellEnd"/>
+            <w:r>
+              <w:t xml:space="preserve"> array </w:t>
+            </w:r>
+            <w:proofErr w:type="spellStart"/>
+            <w:r>
+              <w:t>seperti</w:t>
+            </w:r>
+            <w:proofErr w:type="spellEnd"/>
+            <w:r>
+              <w:t xml:space="preserve"> map pada </w:t>
+            </w:r>
+            <w:proofErr w:type="spellStart"/>
+            <w:r>
+              <w:t>hasil</w:t>
+            </w:r>
+            <w:proofErr w:type="spellEnd"/>
+            <w:r>
+              <w:t xml:space="preserve"> </w:t>
+            </w:r>
+            <w:proofErr w:type="spellStart"/>
+            <w:r>
+              <w:t>querySelectorAll</w:t>
+            </w:r>
+            <w:proofErr w:type="spellEnd"/>
+            <w:r>
+              <w:t>.</w:t>
+            </w:r>
           </w:p>
         </w:tc>
       </w:tr>
@@ -15242,6 +16696,73 @@
             <w:pPr>
               <w:spacing w:before="20" w:after="20" w:line="252" w:lineRule="auto"/>
             </w:pPr>
+            <w:r>
+              <w:t xml:space="preserve">Saat </w:t>
+            </w:r>
+            <w:proofErr w:type="spellStart"/>
+            <w:r>
+              <w:t>ingin</w:t>
+            </w:r>
+            <w:proofErr w:type="spellEnd"/>
+            <w:r>
+              <w:t xml:space="preserve"> </w:t>
+            </w:r>
+            <w:proofErr w:type="spellStart"/>
+            <w:r>
+              <w:t>membuat</w:t>
+            </w:r>
+            <w:proofErr w:type="spellEnd"/>
+            <w:r>
+              <w:t xml:space="preserve"> </w:t>
+            </w:r>
+            <w:proofErr w:type="spellStart"/>
+            <w:r>
+              <w:t>kartu</w:t>
+            </w:r>
+            <w:proofErr w:type="spellEnd"/>
+            <w:r>
+              <w:t xml:space="preserve"> </w:t>
+            </w:r>
+            <w:proofErr w:type="spellStart"/>
+            <w:r>
+              <w:t>proyek</w:t>
+            </w:r>
+            <w:proofErr w:type="spellEnd"/>
+            <w:r>
+              <w:t xml:space="preserve"> </w:t>
+            </w:r>
+            <w:proofErr w:type="spellStart"/>
+            <w:r>
+              <w:t>berbentuk</w:t>
+            </w:r>
+            <w:proofErr w:type="spellEnd"/>
+            <w:r>
+              <w:t xml:space="preserve"> </w:t>
+            </w:r>
+            <w:proofErr w:type="spellStart"/>
+            <w:r>
+              <w:t>elemen</w:t>
+            </w:r>
+            <w:proofErr w:type="spellEnd"/>
+            <w:r>
+              <w:t xml:space="preserve"> &lt;li&gt; </w:t>
+            </w:r>
+            <w:proofErr w:type="spellStart"/>
+            <w:r>
+              <w:t>secara</w:t>
+            </w:r>
+            <w:proofErr w:type="spellEnd"/>
+            <w:r>
+              <w:t xml:space="preserve"> </w:t>
+            </w:r>
+            <w:proofErr w:type="spellStart"/>
+            <w:r>
+              <w:t>dinamis</w:t>
+            </w:r>
+            <w:proofErr w:type="spellEnd"/>
+            <w:r>
+              <w:t>.</w:t>
+            </w:r>
           </w:p>
         </w:tc>
       </w:tr>
@@ -15311,6 +16832,113 @@
             <w:pPr>
               <w:spacing w:before="20" w:after="20" w:line="252" w:lineRule="auto"/>
             </w:pPr>
+            <w:r>
+              <w:t xml:space="preserve">Saat </w:t>
+            </w:r>
+            <w:proofErr w:type="spellStart"/>
+            <w:r>
+              <w:t>ingin</w:t>
+            </w:r>
+            <w:proofErr w:type="spellEnd"/>
+            <w:r>
+              <w:t xml:space="preserve"> </w:t>
+            </w:r>
+            <w:proofErr w:type="spellStart"/>
+            <w:r>
+              <w:t>menampilkan</w:t>
+            </w:r>
+            <w:proofErr w:type="spellEnd"/>
+            <w:r>
+              <w:t xml:space="preserve"> </w:t>
+            </w:r>
+            <w:proofErr w:type="spellStart"/>
+            <w:r>
+              <w:t>judul</w:t>
+            </w:r>
+            <w:proofErr w:type="spellEnd"/>
+            <w:r>
+              <w:t xml:space="preserve"> </w:t>
+            </w:r>
+            <w:proofErr w:type="spellStart"/>
+            <w:r>
+              <w:t>proyek</w:t>
+            </w:r>
+            <w:proofErr w:type="spellEnd"/>
+            <w:r>
+              <w:t xml:space="preserve"> </w:t>
+            </w:r>
+            <w:proofErr w:type="spellStart"/>
+            <w:r>
+              <w:t>sebagai</w:t>
+            </w:r>
+            <w:proofErr w:type="spellEnd"/>
+            <w:r>
+              <w:t xml:space="preserve"> </w:t>
+            </w:r>
+            <w:proofErr w:type="spellStart"/>
+            <w:r>
+              <w:t>teks</w:t>
+            </w:r>
+            <w:proofErr w:type="spellEnd"/>
+            <w:r>
+              <w:t xml:space="preserve"> </w:t>
+            </w:r>
+            <w:proofErr w:type="spellStart"/>
+            <w:r>
+              <w:t>atau</w:t>
+            </w:r>
+            <w:proofErr w:type="spellEnd"/>
+            <w:r>
+              <w:t xml:space="preserve"> </w:t>
+            </w:r>
+            <w:proofErr w:type="spellStart"/>
+            <w:r>
+              <w:t>mengosongkan</w:t>
+            </w:r>
+            <w:proofErr w:type="spellEnd"/>
+            <w:r>
+              <w:t xml:space="preserve"> </w:t>
+            </w:r>
+            <w:proofErr w:type="spellStart"/>
+            <w:r>
+              <w:t>isi</w:t>
+            </w:r>
+            <w:proofErr w:type="spellEnd"/>
+            <w:r>
+              <w:t xml:space="preserve"> </w:t>
+            </w:r>
+            <w:proofErr w:type="spellStart"/>
+            <w:r>
+              <w:t>wadah</w:t>
+            </w:r>
+            <w:proofErr w:type="spellEnd"/>
+            <w:r>
+              <w:t xml:space="preserve"> </w:t>
+            </w:r>
+            <w:proofErr w:type="spellStart"/>
+            <w:r>
+              <w:t>sebelum</w:t>
+            </w:r>
+            <w:proofErr w:type="spellEnd"/>
+            <w:r>
+              <w:t xml:space="preserve"> </w:t>
+            </w:r>
+            <w:proofErr w:type="spellStart"/>
+            <w:r>
+              <w:t>menampilkan</w:t>
+            </w:r>
+            <w:proofErr w:type="spellEnd"/>
+            <w:r>
+              <w:t xml:space="preserve"> </w:t>
+            </w:r>
+            <w:proofErr w:type="spellStart"/>
+            <w:r>
+              <w:t>hasil</w:t>
+            </w:r>
+            <w:proofErr w:type="spellEnd"/>
+            <w:r>
+              <w:t xml:space="preserve"> filter.</w:t>
+            </w:r>
           </w:p>
         </w:tc>
       </w:tr>
@@ -15380,6 +17008,68 @@
             <w:pPr>
               <w:spacing w:before="20" w:after="20" w:line="252" w:lineRule="auto"/>
             </w:pPr>
+            <w:r>
+              <w:t xml:space="preserve">Saat </w:t>
+            </w:r>
+            <w:proofErr w:type="spellStart"/>
+            <w:r>
+              <w:t>ingin</w:t>
+            </w:r>
+            <w:proofErr w:type="spellEnd"/>
+            <w:r>
+              <w:t xml:space="preserve"> </w:t>
+            </w:r>
+            <w:proofErr w:type="spellStart"/>
+            <w:r>
+              <w:t>menambahkan</w:t>
+            </w:r>
+            <w:proofErr w:type="spellEnd"/>
+            <w:r>
+              <w:t xml:space="preserve"> </w:t>
+            </w:r>
+            <w:proofErr w:type="spellStart"/>
+            <w:r>
+              <w:t>kartu</w:t>
+            </w:r>
+            <w:proofErr w:type="spellEnd"/>
+            <w:r>
+              <w:t xml:space="preserve"> </w:t>
+            </w:r>
+            <w:proofErr w:type="spellStart"/>
+            <w:r>
+              <w:t>proyek</w:t>
+            </w:r>
+            <w:proofErr w:type="spellEnd"/>
+            <w:r>
+              <w:t xml:space="preserve"> </w:t>
+            </w:r>
+            <w:proofErr w:type="spellStart"/>
+            <w:r>
+              <w:t>ke</w:t>
+            </w:r>
+            <w:proofErr w:type="spellEnd"/>
+            <w:r>
+              <w:t xml:space="preserve"> </w:t>
+            </w:r>
+            <w:proofErr w:type="spellStart"/>
+            <w:r>
+              <w:t>dalam</w:t>
+            </w:r>
+            <w:proofErr w:type="spellEnd"/>
+            <w:r>
+              <w:t xml:space="preserve"> </w:t>
+            </w:r>
+            <w:proofErr w:type="spellStart"/>
+            <w:r>
+              <w:t>wadah</w:t>
+            </w:r>
+            <w:proofErr w:type="spellEnd"/>
+            <w:r>
+              <w:t xml:space="preserve"> daftar</w:t>
+            </w:r>
+            <w:r>
+              <w:t>.</w:t>
+            </w:r>
           </w:p>
         </w:tc>
       </w:tr>
@@ -15449,6 +17139,73 @@
             <w:pPr>
               <w:spacing w:before="20" w:after="20" w:line="252" w:lineRule="auto"/>
             </w:pPr>
+            <w:r>
+              <w:t xml:space="preserve">Saat </w:t>
+            </w:r>
+            <w:proofErr w:type="spellStart"/>
+            <w:r>
+              <w:t>ingin</w:t>
+            </w:r>
+            <w:proofErr w:type="spellEnd"/>
+            <w:r>
+              <w:t xml:space="preserve"> </w:t>
+            </w:r>
+            <w:proofErr w:type="spellStart"/>
+            <w:r>
+              <w:t>mengosongkan</w:t>
+            </w:r>
+            <w:proofErr w:type="spellEnd"/>
+            <w:r>
+              <w:t xml:space="preserve"> </w:t>
+            </w:r>
+            <w:proofErr w:type="spellStart"/>
+            <w:r>
+              <w:t>wadah</w:t>
+            </w:r>
+            <w:proofErr w:type="spellEnd"/>
+            <w:r>
+              <w:t xml:space="preserve"> </w:t>
+            </w:r>
+            <w:proofErr w:type="spellStart"/>
+            <w:r>
+              <w:t>atau</w:t>
+            </w:r>
+            <w:proofErr w:type="spellEnd"/>
+            <w:r>
+              <w:t xml:space="preserve"> </w:t>
+            </w:r>
+            <w:proofErr w:type="spellStart"/>
+            <w:r>
+              <w:t>mengganti</w:t>
+            </w:r>
+            <w:proofErr w:type="spellEnd"/>
+            <w:r>
+              <w:t xml:space="preserve"> </w:t>
+            </w:r>
+            <w:proofErr w:type="spellStart"/>
+            <w:r>
+              <w:t>seluruh</w:t>
+            </w:r>
+            <w:proofErr w:type="spellEnd"/>
+            <w:r>
+              <w:t xml:space="preserve"> </w:t>
+            </w:r>
+            <w:proofErr w:type="spellStart"/>
+            <w:r>
+              <w:t>isinya</w:t>
+            </w:r>
+            <w:proofErr w:type="spellEnd"/>
+            <w:r>
+              <w:t xml:space="preserve"> </w:t>
+            </w:r>
+            <w:proofErr w:type="spellStart"/>
+            <w:r>
+              <w:t>sekaligus</w:t>
+            </w:r>
+            <w:proofErr w:type="spellEnd"/>
+            <w:r>
+              <w:t>.</w:t>
+            </w:r>
           </w:p>
         </w:tc>
       </w:tr>
@@ -15477,6 +17234,7 @@
                 <w:rFonts w:cs="Carlito"/>
                 <w:sz w:val="19"/>
               </w:rPr>
+              <w:lastRenderedPageBreak/>
               <w:t>classList.toggle</w:t>
             </w:r>
           </w:p>
@@ -15518,6 +17276,97 @@
             <w:pPr>
               <w:spacing w:before="20" w:after="20" w:line="252" w:lineRule="auto"/>
             </w:pPr>
+            <w:r>
+              <w:t xml:space="preserve">Saat </w:t>
+            </w:r>
+            <w:proofErr w:type="spellStart"/>
+            <w:r>
+              <w:t>ingin</w:t>
+            </w:r>
+            <w:proofErr w:type="spellEnd"/>
+            <w:r>
+              <w:t xml:space="preserve"> </w:t>
+            </w:r>
+            <w:proofErr w:type="spellStart"/>
+            <w:r>
+              <w:t>mengaktifkan</w:t>
+            </w:r>
+            <w:proofErr w:type="spellEnd"/>
+            <w:r>
+              <w:t xml:space="preserve"> </w:t>
+            </w:r>
+            <w:proofErr w:type="spellStart"/>
+            <w:r>
+              <w:t>atau</w:t>
+            </w:r>
+            <w:proofErr w:type="spellEnd"/>
+            <w:r>
+              <w:t xml:space="preserve"> </w:t>
+            </w:r>
+            <w:proofErr w:type="spellStart"/>
+            <w:r>
+              <w:t>menonaktifkan</w:t>
+            </w:r>
+            <w:proofErr w:type="spellEnd"/>
+            <w:r>
+              <w:t xml:space="preserve"> </w:t>
+            </w:r>
+            <w:proofErr w:type="spellStart"/>
+            <w:r>
+              <w:t>kelas</w:t>
+            </w:r>
+            <w:proofErr w:type="spellEnd"/>
+            <w:r>
+              <w:t xml:space="preserve">, </w:t>
+            </w:r>
+            <w:proofErr w:type="spellStart"/>
+            <w:r>
+              <w:t>misalnya</w:t>
+            </w:r>
+            <w:proofErr w:type="spellEnd"/>
+            <w:r>
+              <w:t xml:space="preserve"> </w:t>
+            </w:r>
+            <w:proofErr w:type="spellStart"/>
+            <w:r>
+              <w:t>untuk</w:t>
+            </w:r>
+            <w:proofErr w:type="spellEnd"/>
+            <w:r>
+              <w:t xml:space="preserve"> </w:t>
+            </w:r>
+            <w:proofErr w:type="spellStart"/>
+            <w:r>
+              <w:t>menandai</w:t>
+            </w:r>
+            <w:proofErr w:type="spellEnd"/>
+            <w:r>
+              <w:t xml:space="preserve"> </w:t>
+            </w:r>
+            <w:proofErr w:type="spellStart"/>
+            <w:r>
+              <w:t>tombol</w:t>
+            </w:r>
+            <w:proofErr w:type="spellEnd"/>
+            <w:r>
+              <w:t xml:space="preserve"> filter yang </w:t>
+            </w:r>
+            <w:proofErr w:type="spellStart"/>
+            <w:r>
+              <w:t>sedang</w:t>
+            </w:r>
+            <w:proofErr w:type="spellEnd"/>
+            <w:r>
+              <w:t xml:space="preserve"> </w:t>
+            </w:r>
+            <w:proofErr w:type="spellStart"/>
+            <w:r>
+              <w:t>dipilih</w:t>
+            </w:r>
+            <w:proofErr w:type="spellEnd"/>
+            <w:r>
+              <w:t>.</w:t>
+            </w:r>
           </w:p>
         </w:tc>
       </w:tr>
@@ -15587,6 +17436,89 @@
             <w:pPr>
               <w:spacing w:before="20" w:after="20" w:line="252" w:lineRule="auto"/>
             </w:pPr>
+            <w:r>
+              <w:t xml:space="preserve">Saat </w:t>
+            </w:r>
+            <w:proofErr w:type="spellStart"/>
+            <w:r>
+              <w:t>ingin</w:t>
+            </w:r>
+            <w:proofErr w:type="spellEnd"/>
+            <w:r>
+              <w:t xml:space="preserve"> </w:t>
+            </w:r>
+            <w:proofErr w:type="spellStart"/>
+            <w:r>
+              <w:t>menjalankan</w:t>
+            </w:r>
+            <w:proofErr w:type="spellEnd"/>
+            <w:r>
+              <w:t xml:space="preserve"> </w:t>
+            </w:r>
+            <w:proofErr w:type="spellStart"/>
+            <w:r>
+              <w:t>kode</w:t>
+            </w:r>
+            <w:proofErr w:type="spellEnd"/>
+            <w:r>
+              <w:t xml:space="preserve"> </w:t>
+            </w:r>
+            <w:proofErr w:type="spellStart"/>
+            <w:r>
+              <w:t>sebagai</w:t>
+            </w:r>
+            <w:proofErr w:type="spellEnd"/>
+            <w:r>
+              <w:t xml:space="preserve"> </w:t>
+            </w:r>
+            <w:proofErr w:type="spellStart"/>
+            <w:r>
+              <w:t>respons</w:t>
+            </w:r>
+            <w:proofErr w:type="spellEnd"/>
+            <w:r>
+              <w:t xml:space="preserve"> </w:t>
+            </w:r>
+            <w:proofErr w:type="spellStart"/>
+            <w:r>
+              <w:t>terhadap</w:t>
+            </w:r>
+            <w:proofErr w:type="spellEnd"/>
+            <w:r>
+              <w:t xml:space="preserve"> </w:t>
+            </w:r>
+            <w:proofErr w:type="spellStart"/>
+            <w:r>
+              <w:t>peristiwa</w:t>
+            </w:r>
+            <w:proofErr w:type="spellEnd"/>
+            <w:r>
+              <w:t xml:space="preserve">, </w:t>
+            </w:r>
+            <w:proofErr w:type="spellStart"/>
+            <w:r>
+              <w:t>seperti</w:t>
+            </w:r>
+            <w:proofErr w:type="spellEnd"/>
+            <w:r>
+              <w:t xml:space="preserve"> </w:t>
+            </w:r>
+            <w:proofErr w:type="spellStart"/>
+            <w:r>
+              <w:t>klik</w:t>
+            </w:r>
+            <w:proofErr w:type="spellEnd"/>
+            <w:r>
+              <w:t xml:space="preserve"> </w:t>
+            </w:r>
+            <w:proofErr w:type="spellStart"/>
+            <w:r>
+              <w:t>tombol</w:t>
+            </w:r>
+            <w:proofErr w:type="spellEnd"/>
+            <w:r>
+              <w:t xml:space="preserve"> filter.</w:t>
+            </w:r>
           </w:p>
         </w:tc>
       </w:tr>
@@ -15656,6 +17588,97 @@
             <w:pPr>
               <w:spacing w:before="20" w:after="20" w:line="252" w:lineRule="auto"/>
             </w:pPr>
+            <w:r>
+              <w:t xml:space="preserve">Saat </w:t>
+            </w:r>
+            <w:proofErr w:type="spellStart"/>
+            <w:r>
+              <w:t>ingin</w:t>
+            </w:r>
+            <w:proofErr w:type="spellEnd"/>
+            <w:r>
+              <w:t xml:space="preserve"> </w:t>
+            </w:r>
+            <w:proofErr w:type="spellStart"/>
+            <w:r>
+              <w:t>mengetahui</w:t>
+            </w:r>
+            <w:proofErr w:type="spellEnd"/>
+            <w:r>
+              <w:t xml:space="preserve"> </w:t>
+            </w:r>
+            <w:proofErr w:type="spellStart"/>
+            <w:r>
+              <w:t>tombol</w:t>
+            </w:r>
+            <w:proofErr w:type="spellEnd"/>
+            <w:r>
+              <w:t xml:space="preserve"> yang </w:t>
+            </w:r>
+            <w:proofErr w:type="spellStart"/>
+            <w:r>
+              <w:t>diklik</w:t>
+            </w:r>
+            <w:proofErr w:type="spellEnd"/>
+            <w:r>
+              <w:t xml:space="preserve">, </w:t>
+            </w:r>
+            <w:proofErr w:type="spellStart"/>
+            <w:r>
+              <w:t>termasuk</w:t>
+            </w:r>
+            <w:proofErr w:type="spellEnd"/>
+            <w:r>
+              <w:t xml:space="preserve"> </w:t>
+            </w:r>
+            <w:proofErr w:type="spellStart"/>
+            <w:r>
+              <w:t>ketika</w:t>
+            </w:r>
+            <w:proofErr w:type="spellEnd"/>
+            <w:r>
+              <w:t xml:space="preserve"> </w:t>
+            </w:r>
+            <w:proofErr w:type="spellStart"/>
+            <w:r>
+              <w:t>pengguna</w:t>
+            </w:r>
+            <w:proofErr w:type="spellEnd"/>
+            <w:r>
+              <w:t xml:space="preserve"> </w:t>
+            </w:r>
+            <w:proofErr w:type="spellStart"/>
+            <w:r>
+              <w:t>mengklik</w:t>
+            </w:r>
+            <w:proofErr w:type="spellEnd"/>
+            <w:r>
+              <w:t xml:space="preserve"> </w:t>
+            </w:r>
+            <w:proofErr w:type="spellStart"/>
+            <w:r>
+              <w:t>elemen</w:t>
+            </w:r>
+            <w:proofErr w:type="spellEnd"/>
+            <w:r>
+              <w:t xml:space="preserve"> di </w:t>
+            </w:r>
+            <w:proofErr w:type="spellStart"/>
+            <w:r>
+              <w:t>dalam</w:t>
+            </w:r>
+            <w:proofErr w:type="spellEnd"/>
+            <w:r>
+              <w:t xml:space="preserve"> </w:t>
+            </w:r>
+            <w:proofErr w:type="spellStart"/>
+            <w:r>
+              <w:t>tombol</w:t>
+            </w:r>
+            <w:proofErr w:type="spellEnd"/>
+            <w:r>
+              <w:t>.</w:t>
+            </w:r>
           </w:p>
         </w:tc>
       </w:tr>
@@ -15684,7 +17707,6 @@
                 <w:rFonts w:cs="Carlito"/>
                 <w:sz w:val="19"/>
               </w:rPr>
-              <w:lastRenderedPageBreak/>
               <w:t>preventDefault()</w:t>
             </w:r>
           </w:p>
@@ -15726,6 +17748,97 @@
             <w:pPr>
               <w:spacing w:before="20" w:after="20" w:line="252" w:lineRule="auto"/>
             </w:pPr>
+            <w:r>
+              <w:t xml:space="preserve">Saat </w:t>
+            </w:r>
+            <w:proofErr w:type="spellStart"/>
+            <w:r>
+              <w:t>ingin</w:t>
+            </w:r>
+            <w:proofErr w:type="spellEnd"/>
+            <w:r>
+              <w:t xml:space="preserve"> </w:t>
+            </w:r>
+            <w:proofErr w:type="spellStart"/>
+            <w:r>
+              <w:t>mencegah</w:t>
+            </w:r>
+            <w:proofErr w:type="spellEnd"/>
+            <w:r>
+              <w:t xml:space="preserve"> </w:t>
+            </w:r>
+            <w:proofErr w:type="spellStart"/>
+            <w:r>
+              <w:t>perilaku</w:t>
+            </w:r>
+            <w:proofErr w:type="spellEnd"/>
+            <w:r>
+              <w:t xml:space="preserve"> </w:t>
+            </w:r>
+            <w:proofErr w:type="spellStart"/>
+            <w:r>
+              <w:t>bawaan</w:t>
+            </w:r>
+            <w:proofErr w:type="spellEnd"/>
+            <w:r>
+              <w:t xml:space="preserve">, </w:t>
+            </w:r>
+            <w:proofErr w:type="spellStart"/>
+            <w:r>
+              <w:t>misalnya</w:t>
+            </w:r>
+            <w:proofErr w:type="spellEnd"/>
+            <w:r>
+              <w:t xml:space="preserve"> </w:t>
+            </w:r>
+            <w:proofErr w:type="spellStart"/>
+            <w:r>
+              <w:t>halaman</w:t>
+            </w:r>
+            <w:proofErr w:type="spellEnd"/>
+            <w:r>
+              <w:t xml:space="preserve"> </w:t>
+            </w:r>
+            <w:proofErr w:type="spellStart"/>
+            <w:r>
+              <w:t>dimuat</w:t>
+            </w:r>
+            <w:proofErr w:type="spellEnd"/>
+            <w:r>
+              <w:t xml:space="preserve"> </w:t>
+            </w:r>
+            <w:proofErr w:type="spellStart"/>
+            <w:r>
+              <w:t>ulang</w:t>
+            </w:r>
+            <w:proofErr w:type="spellEnd"/>
+            <w:r>
+              <w:t xml:space="preserve"> </w:t>
+            </w:r>
+            <w:proofErr w:type="spellStart"/>
+            <w:r>
+              <w:t>ketika</w:t>
+            </w:r>
+            <w:proofErr w:type="spellEnd"/>
+            <w:r>
+              <w:t xml:space="preserve"> </w:t>
+            </w:r>
+            <w:proofErr w:type="spellStart"/>
+            <w:r>
+              <w:t>formulir</w:t>
+            </w:r>
+            <w:proofErr w:type="spellEnd"/>
+            <w:r>
+              <w:t xml:space="preserve"> </w:t>
+            </w:r>
+            <w:proofErr w:type="spellStart"/>
+            <w:r>
+              <w:t>dikirim</w:t>
+            </w:r>
+            <w:proofErr w:type="spellEnd"/>
+            <w:r>
+              <w:t>.</w:t>
+            </w:r>
           </w:p>
         </w:tc>
       </w:tr>
@@ -15795,6 +17908,65 @@
             <w:pPr>
               <w:spacing w:before="20" w:after="20" w:line="252" w:lineRule="auto"/>
             </w:pPr>
+            <w:r>
+              <w:t xml:space="preserve">Saat </w:t>
+            </w:r>
+            <w:proofErr w:type="spellStart"/>
+            <w:r>
+              <w:t>ingin</w:t>
+            </w:r>
+            <w:proofErr w:type="spellEnd"/>
+            <w:r>
+              <w:t xml:space="preserve"> </w:t>
+            </w:r>
+            <w:proofErr w:type="spellStart"/>
+            <w:r>
+              <w:t>mengambil</w:t>
+            </w:r>
+            <w:proofErr w:type="spellEnd"/>
+            <w:r>
+              <w:t xml:space="preserve"> </w:t>
+            </w:r>
+            <w:proofErr w:type="spellStart"/>
+            <w:r>
+              <w:t>kategori</w:t>
+            </w:r>
+            <w:proofErr w:type="spellEnd"/>
+            <w:r>
+              <w:t xml:space="preserve"> </w:t>
+            </w:r>
+            <w:proofErr w:type="spellStart"/>
+            <w:r>
+              <w:t>dari</w:t>
+            </w:r>
+            <w:proofErr w:type="spellEnd"/>
+            <w:r>
+              <w:t xml:space="preserve"> </w:t>
+            </w:r>
+            <w:proofErr w:type="spellStart"/>
+            <w:r>
+              <w:t>atribut</w:t>
+            </w:r>
+            <w:proofErr w:type="spellEnd"/>
+            <w:r>
+              <w:t xml:space="preserve"> data-</w:t>
+            </w:r>
+            <w:proofErr w:type="spellStart"/>
+            <w:r>
+              <w:t>kategori</w:t>
+            </w:r>
+            <w:proofErr w:type="spellEnd"/>
+            <w:r>
+              <w:t xml:space="preserve"> pada </w:t>
+            </w:r>
+            <w:proofErr w:type="spellStart"/>
+            <w:r>
+              <w:t>tombol</w:t>
+            </w:r>
+            <w:proofErr w:type="spellEnd"/>
+            <w:r>
+              <w:t xml:space="preserve"> filter.</w:t>
+            </w:r>
           </w:p>
         </w:tc>
       </w:tr>
@@ -16781,6 +18953,7 @@
           <w:b/>
           <w:color w:val="003796"/>
         </w:rPr>
+        <w:lastRenderedPageBreak/>
         <w:t>Tiga perintah yang akan Anda pakai terus</w:t>
       </w:r>
     </w:p>
@@ -17147,17 +19320,7 @@
                 <w:color w:val="003796"/>
                 <w:sz w:val="20"/>
               </w:rPr>
-              <w:t xml:space="preserve">Titik pada git add .  Titik itu berarti "seluruh berkas di folder ini".  Tanpa titik, Git tidak tahu apa yang harus disimpan. Hal yang sama berlaku untuk berkas dom.js yang baru Anda buat — ia ikut tersimpan </w:t>
-            </w:r>
-            <w:r>
-              <w:rPr>
-                <w:rFonts w:cs="Carlito"/>
-                <w:b/>
-                <w:color w:val="003796"/>
-                <w:sz w:val="20"/>
-              </w:rPr>
-              <w:lastRenderedPageBreak/>
-              <w:t>karena berada di dalam folder semester.</w:t>
+              <w:t>Titik pada git add .  Titik itu berarti "seluruh berkas di folder ini".  Tanpa titik, Git tidak tahu apa yang harus disimpan. Hal yang sama berlaku untuk berkas dom.js yang baru Anda buat — ia ikut tersimpan karena berada di dalam folder semester.</w:t>
             </w:r>
           </w:p>
         </w:tc>
@@ -17475,7 +19638,7 @@
       </w:pPr>
     </w:p>
     <w:sectPr>
-      <w:footerReference w:type="default" r:id="rId9"/>
+      <w:footerReference w:type="default" r:id="rId10"/>
       <w:pgSz w:w="11906" w:h="16838"/>
       <w:pgMar w:top="964" w:right="1077" w:bottom="907" w:left="1077" w:header="720" w:footer="720" w:gutter="0"/>
       <w:cols w:space="720"/>
@@ -17523,25 +19686,7 @@
         <w:color w:val="5A6080"/>
         <w:sz w:val="15"/>
       </w:rPr>
-      <w:t>PABW 2026/</w:t>
-    </w:r>
-    <w:proofErr w:type="gramStart"/>
-    <w:r>
-      <w:rPr>
-        <w:rFonts w:cs="Carlito"/>
-        <w:color w:val="5A6080"/>
-        <w:sz w:val="15"/>
-      </w:rPr>
-      <w:t>2027  ·</w:t>
-    </w:r>
-    <w:proofErr w:type="gramEnd"/>
-    <w:r>
-      <w:rPr>
-        <w:rFonts w:cs="Carlito"/>
-        <w:color w:val="5A6080"/>
-        <w:sz w:val="15"/>
-      </w:rPr>
-      <w:t xml:space="preserve">  </w:t>
+      <w:t xml:space="preserve">PABW 2026/2027  ·  </w:t>
     </w:r>
     <w:proofErr w:type="spellStart"/>
     <w:r>
@@ -17559,61 +19704,7 @@
         <w:color w:val="5A6080"/>
         <w:sz w:val="15"/>
       </w:rPr>
-      <w:t xml:space="preserve"> </w:t>
-    </w:r>
-    <w:proofErr w:type="gramStart"/>
-    <w:r>
-      <w:rPr>
-        <w:rFonts w:cs="Carlito"/>
-        <w:color w:val="5A6080"/>
-        <w:sz w:val="15"/>
-      </w:rPr>
-      <w:t>9  ·</w:t>
-    </w:r>
-    <w:proofErr w:type="gramEnd"/>
-    <w:r>
-      <w:rPr>
-        <w:rFonts w:cs="Carlito"/>
-        <w:color w:val="5A6080"/>
-        <w:sz w:val="15"/>
-      </w:rPr>
-      <w:t xml:space="preserve">  DOM dan </w:t>
-    </w:r>
-    <w:proofErr w:type="gramStart"/>
-    <w:r>
-      <w:rPr>
-        <w:rFonts w:cs="Carlito"/>
-        <w:color w:val="5A6080"/>
-        <w:sz w:val="15"/>
-      </w:rPr>
-      <w:t>Event  ·</w:t>
-    </w:r>
-    <w:proofErr w:type="gramEnd"/>
-    <w:r>
-      <w:rPr>
-        <w:rFonts w:cs="Carlito"/>
-        <w:color w:val="5A6080"/>
-        <w:sz w:val="15"/>
-      </w:rPr>
-      <w:t xml:space="preserve">  Universitas Islam </w:t>
-    </w:r>
-    <w:proofErr w:type="gramStart"/>
-    <w:r>
-      <w:rPr>
-        <w:rFonts w:cs="Carlito"/>
-        <w:color w:val="5A6080"/>
-        <w:sz w:val="15"/>
-      </w:rPr>
-      <w:t>Indonesia  ·</w:t>
-    </w:r>
-    <w:proofErr w:type="gramEnd"/>
-    <w:r>
-      <w:rPr>
-        <w:rFonts w:cs="Carlito"/>
-        <w:color w:val="5A6080"/>
-        <w:sz w:val="15"/>
-      </w:rPr>
-      <w:t xml:space="preserve">  halaman</w:t>
+      <w:t xml:space="preserve"> 9  ·  DOM dan Event  ·  Universitas Islam Indonesia  ·  halaman</w:t>
     </w:r>
     <w:r>
       <w:fldChar w:fldCharType="begin"/>
@@ -18479,7 +20570,6 @@
   <w:style w:type="character" w:default="1" w:styleId="DefaultParagraphFont">
     <w:name w:val="Default Paragraph Font"/>
     <w:uiPriority w:val="1"/>
-    <w:semiHidden/>
     <w:unhideWhenUsed/>
   </w:style>
   <w:style w:type="table" w:default="1" w:styleId="TableNormal">

</xml_diff>